<commit_message>
completed Data Mining Project
</commit_message>
<xml_diff>
--- a/Final Report.docx
+++ b/Final Report.docx
@@ -200,8 +200,18 @@
                                         <w:sz w:val="21"/>
                                         <w:szCs w:val="21"/>
                                       </w:rPr>
-                                      <w:t>, 2025</w:t>
+                                      <w:t xml:space="preserve">, </w:t>
                                     </w:r>
+                                    <w:proofErr w:type="gramStart"/>
+                                    <w:r>
+                                      <w:rPr>
+                                        <w:color w:val="FFFFFF" w:themeColor="background1"/>
+                                        <w:sz w:val="21"/>
+                                        <w:szCs w:val="21"/>
+                                      </w:rPr>
+                                      <w:t>2025</w:t>
+                                    </w:r>
+                                    <w:proofErr w:type="gramEnd"/>
                                     <w:r>
                                       <w:rPr>
                                         <w:color w:val="FFFFFF" w:themeColor="background1"/>
@@ -359,8 +369,18 @@
                                   <w:sz w:val="21"/>
                                   <w:szCs w:val="21"/>
                                 </w:rPr>
-                                <w:t>, 2025</w:t>
+                                <w:t xml:space="preserve">, </w:t>
                               </w:r>
+                              <w:proofErr w:type="gramStart"/>
+                              <w:r>
+                                <w:rPr>
+                                  <w:color w:val="FFFFFF" w:themeColor="background1"/>
+                                  <w:sz w:val="21"/>
+                                  <w:szCs w:val="21"/>
+                                </w:rPr>
+                                <w:t>2025</w:t>
+                              </w:r>
+                              <w:proofErr w:type="gramEnd"/>
                               <w:r>
                                 <w:rPr>
                                   <w:color w:val="FFFFFF" w:themeColor="background1"/>
@@ -610,8 +630,14 @@
         <w:p>
           <w:pPr>
             <w:pStyle w:val="TOCHeading"/>
+            <w:rPr>
+              <w:rFonts w:ascii="Times New Roman" w:hAnsi="Times New Roman" w:cs="Times New Roman"/>
+            </w:rPr>
           </w:pPr>
           <w:r>
+            <w:rPr>
+              <w:rFonts w:ascii="Times New Roman" w:hAnsi="Times New Roman" w:cs="Times New Roman"/>
+            </w:rPr>
             <w:t>Contents</w:t>
           </w:r>
         </w:p>
@@ -638,7 +664,7 @@
           <w:r>
             <w:fldChar w:fldCharType="separate"/>
           </w:r>
-          <w:hyperlink w:anchor="_Toc201418042" w:history="1">
+          <w:hyperlink w:anchor="_Toc201605758" w:history="1">
             <w:r>
               <w:rPr>
                 <w:rStyle w:val="Hyperlink"/>
@@ -665,7 +691,7 @@
                 <w:noProof/>
                 <w:webHidden/>
               </w:rPr>
-              <w:instrText xml:space="preserve"> PAGEREF _Toc201418042 \h </w:instrText>
+              <w:instrText xml:space="preserve"> PAGEREF _Toc201605758 \h </w:instrText>
             </w:r>
             <w:r>
               <w:rPr>
@@ -710,7 +736,7 @@
               <w14:ligatures w14:val="standardContextual"/>
             </w:rPr>
           </w:pPr>
-          <w:hyperlink w:anchor="_Toc201418043" w:history="1">
+          <w:hyperlink w:anchor="_Toc201605759" w:history="1">
             <w:r>
               <w:rPr>
                 <w:rStyle w:val="Hyperlink"/>
@@ -737,7 +763,7 @@
                 <w:noProof/>
                 <w:webHidden/>
               </w:rPr>
-              <w:instrText xml:space="preserve"> PAGEREF _Toc201418043 \h </w:instrText>
+              <w:instrText xml:space="preserve"> PAGEREF _Toc201605759 \h </w:instrText>
             </w:r>
             <w:r>
               <w:rPr>
@@ -782,7 +808,7 @@
               <w14:ligatures w14:val="standardContextual"/>
             </w:rPr>
           </w:pPr>
-          <w:hyperlink w:anchor="_Toc201418044" w:history="1">
+          <w:hyperlink w:anchor="_Toc201605760" w:history="1">
             <w:r>
               <w:rPr>
                 <w:rStyle w:val="Hyperlink"/>
@@ -809,7 +835,7 @@
                 <w:noProof/>
                 <w:webHidden/>
               </w:rPr>
-              <w:instrText xml:space="preserve"> PAGEREF _Toc201418044 \h </w:instrText>
+              <w:instrText xml:space="preserve"> PAGEREF _Toc201605760 \h </w:instrText>
             </w:r>
             <w:r>
               <w:rPr>
@@ -854,7 +880,7 @@
               <w14:ligatures w14:val="standardContextual"/>
             </w:rPr>
           </w:pPr>
-          <w:hyperlink w:anchor="_Toc201418045" w:history="1">
+          <w:hyperlink w:anchor="_Toc201605761" w:history="1">
             <w:r>
               <w:rPr>
                 <w:rStyle w:val="Hyperlink"/>
@@ -881,7 +907,7 @@
                 <w:noProof/>
                 <w:webHidden/>
               </w:rPr>
-              <w:instrText xml:space="preserve"> PAGEREF _Toc201418045 \h </w:instrText>
+              <w:instrText xml:space="preserve"> PAGEREF _Toc201605761 \h </w:instrText>
             </w:r>
             <w:r>
               <w:rPr>
@@ -926,27 +952,13 @@
               <w14:ligatures w14:val="standardContextual"/>
             </w:rPr>
           </w:pPr>
-          <w:hyperlink w:anchor="_Toc201418046" w:history="1">
+          <w:hyperlink w:anchor="_Toc201605762" w:history="1">
             <w:r>
               <w:rPr>
                 <w:rStyle w:val="Hyperlink"/>
                 <w:noProof/>
               </w:rPr>
-              <w:t>Metho</w:t>
-            </w:r>
-            <w:r>
-              <w:rPr>
-                <w:rStyle w:val="Hyperlink"/>
-                <w:noProof/>
-              </w:rPr>
-              <w:t>d</w:t>
-            </w:r>
-            <w:r>
-              <w:rPr>
-                <w:rStyle w:val="Hyperlink"/>
-                <w:noProof/>
-              </w:rPr>
-              <w:t>ology</w:t>
+              <w:t>Methodology</w:t>
             </w:r>
             <w:r>
               <w:rPr>
@@ -967,7 +979,7 @@
                 <w:noProof/>
                 <w:webHidden/>
               </w:rPr>
-              <w:instrText xml:space="preserve"> PAGEREF _Toc201418046 \h </w:instrText>
+              <w:instrText xml:space="preserve"> PAGEREF _Toc201605762 \h </w:instrText>
             </w:r>
             <w:r>
               <w:rPr>
@@ -1005,10 +1017,14 @@
               <w:tab w:val="right" w:leader="dot" w:pos="9350"/>
             </w:tabs>
             <w:rPr>
+              <w:rFonts w:asciiTheme="minorHAnsi" w:eastAsiaTheme="minorEastAsia" w:hAnsiTheme="minorHAnsi"/>
               <w:noProof/>
+              <w:kern w:val="2"/>
+              <w:szCs w:val="24"/>
+              <w14:ligatures w14:val="standardContextual"/>
             </w:rPr>
           </w:pPr>
-          <w:hyperlink w:anchor="_Toc201418047" w:history="1">
+          <w:hyperlink w:anchor="_Toc201605763" w:history="1">
             <w:r>
               <w:rPr>
                 <w:rStyle w:val="Hyperlink"/>
@@ -1035,7 +1051,7 @@
                 <w:noProof/>
                 <w:webHidden/>
               </w:rPr>
-              <w:instrText xml:space="preserve"> PAGEREF _Toc201418047 \h </w:instrText>
+              <w:instrText xml:space="preserve"> PAGEREF _Toc201605763 \h </w:instrText>
             </w:r>
             <w:r>
               <w:rPr>
@@ -1073,10 +1089,14 @@
               <w:tab w:val="right" w:leader="dot" w:pos="9350"/>
             </w:tabs>
             <w:rPr>
+              <w:rFonts w:asciiTheme="minorHAnsi" w:eastAsiaTheme="minorEastAsia" w:hAnsiTheme="minorHAnsi"/>
               <w:noProof/>
+              <w:kern w:val="2"/>
+              <w:szCs w:val="24"/>
+              <w14:ligatures w14:val="standardContextual"/>
             </w:rPr>
           </w:pPr>
-          <w:hyperlink w:anchor="_Toc201418048" w:history="1">
+          <w:hyperlink w:anchor="_Toc201605764" w:history="1">
             <w:r>
               <w:rPr>
                 <w:rStyle w:val="Hyperlink"/>
@@ -1103,75 +1123,7 @@
                 <w:noProof/>
                 <w:webHidden/>
               </w:rPr>
-              <w:instrText xml:space="preserve"> PAGEREF _Toc201418048 \h </w:instrText>
-            </w:r>
-            <w:r>
-              <w:rPr>
-                <w:noProof/>
-                <w:webHidden/>
-              </w:rPr>
-            </w:r>
-            <w:r>
-              <w:rPr>
-                <w:noProof/>
-                <w:webHidden/>
-              </w:rPr>
-              <w:fldChar w:fldCharType="separate"/>
-            </w:r>
-            <w:r>
-              <w:rPr>
-                <w:noProof/>
-                <w:webHidden/>
-              </w:rPr>
-              <w:t>8</w:t>
-            </w:r>
-            <w:r>
-              <w:rPr>
-                <w:noProof/>
-                <w:webHidden/>
-              </w:rPr>
-              <w:fldChar w:fldCharType="end"/>
-            </w:r>
-          </w:hyperlink>
-        </w:p>
-        <w:p>
-          <w:pPr>
-            <w:pStyle w:val="TOC3"/>
-            <w:tabs>
-              <w:tab w:val="right" w:leader="dot" w:pos="9350"/>
-            </w:tabs>
-            <w:rPr>
-              <w:noProof/>
-            </w:rPr>
-          </w:pPr>
-          <w:hyperlink w:anchor="_Toc201418049" w:history="1">
-            <w:r>
-              <w:rPr>
-                <w:rStyle w:val="Hyperlink"/>
-                <w:noProof/>
-              </w:rPr>
-              <w:t>Warehousing</w:t>
-            </w:r>
-            <w:r>
-              <w:rPr>
-                <w:noProof/>
-                <w:webHidden/>
-              </w:rPr>
-              <w:tab/>
-            </w:r>
-            <w:r>
-              <w:rPr>
-                <w:noProof/>
-                <w:webHidden/>
-              </w:rPr>
-              <w:fldChar w:fldCharType="begin"/>
-            </w:r>
-            <w:r>
-              <w:rPr>
-                <w:noProof/>
-                <w:webHidden/>
-              </w:rPr>
-              <w:instrText xml:space="preserve"> PAGEREF _Toc201418049 \h </w:instrText>
+              <w:instrText xml:space="preserve"> PAGEREF _Toc201605764 \h </w:instrText>
             </w:r>
             <w:r>
               <w:rPr>
@@ -1209,16 +1161,20 @@
               <w:tab w:val="right" w:leader="dot" w:pos="9350"/>
             </w:tabs>
             <w:rPr>
+              <w:rFonts w:asciiTheme="minorHAnsi" w:eastAsiaTheme="minorEastAsia" w:hAnsiTheme="minorHAnsi"/>
               <w:noProof/>
+              <w:kern w:val="2"/>
+              <w:szCs w:val="24"/>
+              <w14:ligatures w14:val="standardContextual"/>
             </w:rPr>
           </w:pPr>
-          <w:hyperlink w:anchor="_Toc201418050" w:history="1">
+          <w:hyperlink w:anchor="_Toc201605765" w:history="1">
             <w:r>
               <w:rPr>
                 <w:rStyle w:val="Hyperlink"/>
                 <w:noProof/>
               </w:rPr>
-              <w:t>Modeling</w:t>
+              <w:t>Warehousing</w:t>
             </w:r>
             <w:r>
               <w:rPr>
@@ -1239,7 +1195,7 @@
                 <w:noProof/>
                 <w:webHidden/>
               </w:rPr>
-              <w:instrText xml:space="preserve"> PAGEREF _Toc201418050 \h </w:instrText>
+              <w:instrText xml:space="preserve"> PAGEREF _Toc201605765 \h </w:instrText>
             </w:r>
             <w:r>
               <w:rPr>
@@ -1277,15 +1233,91 @@
               <w:tab w:val="right" w:leader="dot" w:pos="9350"/>
             </w:tabs>
             <w:rPr>
+              <w:rFonts w:asciiTheme="minorHAnsi" w:eastAsiaTheme="minorEastAsia" w:hAnsiTheme="minorHAnsi"/>
               <w:noProof/>
+              <w:kern w:val="2"/>
+              <w:szCs w:val="24"/>
+              <w14:ligatures w14:val="standardContextual"/>
             </w:rPr>
           </w:pPr>
-          <w:hyperlink w:anchor="_Toc201418051" w:history="1">
+          <w:hyperlink w:anchor="_Toc201605766" w:history="1">
             <w:r>
               <w:rPr>
                 <w:rStyle w:val="Hyperlink"/>
                 <w:noProof/>
               </w:rPr>
+              <w:t>Modeling</w:t>
+            </w:r>
+            <w:r>
+              <w:rPr>
+                <w:noProof/>
+                <w:webHidden/>
+              </w:rPr>
+              <w:tab/>
+            </w:r>
+            <w:r>
+              <w:rPr>
+                <w:noProof/>
+                <w:webHidden/>
+              </w:rPr>
+              <w:fldChar w:fldCharType="begin"/>
+            </w:r>
+            <w:r>
+              <w:rPr>
+                <w:noProof/>
+                <w:webHidden/>
+              </w:rPr>
+              <w:instrText xml:space="preserve"> PAGEREF _Toc201605766 \h </w:instrText>
+            </w:r>
+            <w:r>
+              <w:rPr>
+                <w:noProof/>
+                <w:webHidden/>
+              </w:rPr>
+            </w:r>
+            <w:r>
+              <w:rPr>
+                <w:noProof/>
+                <w:webHidden/>
+              </w:rPr>
+              <w:fldChar w:fldCharType="separate"/>
+            </w:r>
+            <w:r>
+              <w:rPr>
+                <w:noProof/>
+                <w:webHidden/>
+              </w:rPr>
+              <w:t>8</w:t>
+            </w:r>
+            <w:r>
+              <w:rPr>
+                <w:noProof/>
+                <w:webHidden/>
+              </w:rPr>
+              <w:fldChar w:fldCharType="end"/>
+            </w:r>
+          </w:hyperlink>
+        </w:p>
+        <w:p>
+          <w:pPr>
+            <w:pStyle w:val="TOC2"/>
+            <w:tabs>
+              <w:tab w:val="right" w:leader="dot" w:pos="9350"/>
+            </w:tabs>
+            <w:rPr>
+              <w:rFonts w:asciiTheme="minorHAnsi" w:eastAsiaTheme="minorEastAsia" w:hAnsiTheme="minorHAnsi"/>
+              <w:noProof/>
+              <w:kern w:val="2"/>
+              <w:szCs w:val="24"/>
+              <w14:ligatures w14:val="standardContextual"/>
+            </w:rPr>
+          </w:pPr>
+          <w:hyperlink w:anchor="_Toc201605767" w:history="1">
+            <w:r>
+              <w:rPr>
+                <w:rStyle w:val="Hyperlink"/>
+                <w:noProof/>
+              </w:rPr>
               <w:t>Evaluation</w:t>
             </w:r>
             <w:r>
@@ -1307,7 +1339,7 @@
                 <w:noProof/>
                 <w:webHidden/>
               </w:rPr>
-              <w:instrText xml:space="preserve"> PAGEREF _Toc201418051 \h </w:instrText>
+              <w:instrText xml:space="preserve"> PAGEREF _Toc201605767 \h </w:instrText>
             </w:r>
             <w:r>
               <w:rPr>
@@ -1327,7 +1359,7 @@
                 <w:noProof/>
                 <w:webHidden/>
               </w:rPr>
-              <w:t>9</w:t>
+              <w:t>10</w:t>
             </w:r>
             <w:r>
               <w:rPr>
@@ -1352,13 +1384,13 @@
               <w14:ligatures w14:val="standardContextual"/>
             </w:rPr>
           </w:pPr>
-          <w:hyperlink w:anchor="_Toc201418052" w:history="1">
+          <w:hyperlink w:anchor="_Toc201605768" w:history="1">
             <w:r>
               <w:rPr>
                 <w:rStyle w:val="Hyperlink"/>
                 <w:noProof/>
               </w:rPr>
-              <w:t>Discussion</w:t>
+              <w:t>Results</w:t>
             </w:r>
             <w:r>
               <w:rPr>
@@ -1379,7 +1411,7 @@
                 <w:noProof/>
                 <w:webHidden/>
               </w:rPr>
-              <w:instrText xml:space="preserve"> PAGEREF _Toc201418052 \h </w:instrText>
+              <w:instrText xml:space="preserve"> PAGEREF _Toc201605768 \h </w:instrText>
             </w:r>
             <w:r>
               <w:rPr>
@@ -1424,13 +1456,13 @@
               <w14:ligatures w14:val="standardContextual"/>
             </w:rPr>
           </w:pPr>
-          <w:hyperlink w:anchor="_Toc201418053" w:history="1">
+          <w:hyperlink w:anchor="_Toc201605769" w:history="1">
             <w:r>
               <w:rPr>
                 <w:rStyle w:val="Hyperlink"/>
                 <w:noProof/>
               </w:rPr>
-              <w:t>Conclusion</w:t>
+              <w:t>Discussion</w:t>
             </w:r>
             <w:r>
               <w:rPr>
@@ -1451,7 +1483,7 @@
                 <w:noProof/>
                 <w:webHidden/>
               </w:rPr>
-              <w:instrText xml:space="preserve"> PAGEREF _Toc201418053 \h </w:instrText>
+              <w:instrText xml:space="preserve"> PAGEREF _Toc201605769 \h </w:instrText>
             </w:r>
             <w:r>
               <w:rPr>
@@ -1496,12 +1528,84 @@
               <w14:ligatures w14:val="standardContextual"/>
             </w:rPr>
           </w:pPr>
-          <w:hyperlink w:anchor="_Toc201418054" w:history="1">
+          <w:hyperlink w:anchor="_Toc201605770" w:history="1">
             <w:r>
               <w:rPr>
                 <w:rStyle w:val="Hyperlink"/>
                 <w:noProof/>
               </w:rPr>
+              <w:t>Conclusion</w:t>
+            </w:r>
+            <w:r>
+              <w:rPr>
+                <w:noProof/>
+                <w:webHidden/>
+              </w:rPr>
+              <w:tab/>
+            </w:r>
+            <w:r>
+              <w:rPr>
+                <w:noProof/>
+                <w:webHidden/>
+              </w:rPr>
+              <w:fldChar w:fldCharType="begin"/>
+            </w:r>
+            <w:r>
+              <w:rPr>
+                <w:noProof/>
+                <w:webHidden/>
+              </w:rPr>
+              <w:instrText xml:space="preserve"> PAGEREF _Toc201605770 \h </w:instrText>
+            </w:r>
+            <w:r>
+              <w:rPr>
+                <w:noProof/>
+                <w:webHidden/>
+              </w:rPr>
+            </w:r>
+            <w:r>
+              <w:rPr>
+                <w:noProof/>
+                <w:webHidden/>
+              </w:rPr>
+              <w:fldChar w:fldCharType="separate"/>
+            </w:r>
+            <w:r>
+              <w:rPr>
+                <w:noProof/>
+                <w:webHidden/>
+              </w:rPr>
+              <w:t>14</w:t>
+            </w:r>
+            <w:r>
+              <w:rPr>
+                <w:noProof/>
+                <w:webHidden/>
+              </w:rPr>
+              <w:fldChar w:fldCharType="end"/>
+            </w:r>
+          </w:hyperlink>
+        </w:p>
+        <w:p>
+          <w:pPr>
+            <w:pStyle w:val="TOC1"/>
+            <w:tabs>
+              <w:tab w:val="right" w:leader="dot" w:pos="9350"/>
+            </w:tabs>
+            <w:rPr>
+              <w:rFonts w:asciiTheme="minorHAnsi" w:eastAsiaTheme="minorEastAsia" w:hAnsiTheme="minorHAnsi"/>
+              <w:noProof/>
+              <w:kern w:val="2"/>
+              <w:szCs w:val="24"/>
+              <w14:ligatures w14:val="standardContextual"/>
+            </w:rPr>
+          </w:pPr>
+          <w:hyperlink w:anchor="_Toc201605771" w:history="1">
+            <w:r>
+              <w:rPr>
+                <w:rStyle w:val="Hyperlink"/>
+                <w:noProof/>
+              </w:rPr>
               <w:t>References</w:t>
             </w:r>
             <w:r>
@@ -1523,7 +1627,7 @@
                 <w:noProof/>
                 <w:webHidden/>
               </w:rPr>
-              <w:instrText xml:space="preserve"> PAGEREF _Toc201418054 \h </w:instrText>
+              <w:instrText xml:space="preserve"> PAGEREF _Toc201605771 \h </w:instrText>
             </w:r>
             <w:r>
               <w:rPr>
@@ -1543,7 +1647,7 @@
                 <w:noProof/>
                 <w:webHidden/>
               </w:rPr>
-              <w:t>12</w:t>
+              <w:t>14</w:t>
             </w:r>
             <w:r>
               <w:rPr>
@@ -1586,7 +1690,7 @@
       <w:pPr>
         <w:pStyle w:val="Heading1"/>
       </w:pPr>
-      <w:bookmarkStart w:id="0" w:name="_Toc201418042"/>
+      <w:bookmarkStart w:id="0" w:name="_Toc201605758"/>
       <w:r>
         <w:lastRenderedPageBreak/>
         <w:t>Abbreviations</w:t>
@@ -1693,6 +1797,72 @@
       </w:r>
       <w:r>
         <w:t>Motor (on a drill string)</w:t>
+      </w:r>
+    </w:p>
+    <w:p>
+      <w:pPr>
+        <w:spacing w:line="240" w:lineRule="auto"/>
+      </w:pPr>
+      <w:r>
+        <w:t>MWD</w:t>
+      </w:r>
+      <w:r>
+        <w:tab/>
+      </w:r>
+      <w:r>
+        <w:tab/>
+        <w:t>Measurement While Drilling</w:t>
+      </w:r>
+    </w:p>
+    <w:p>
+      <w:pPr>
+        <w:spacing w:line="240" w:lineRule="auto"/>
+      </w:pPr>
+      <w:r>
+        <w:t>PCA</w:t>
+      </w:r>
+      <w:r>
+        <w:tab/>
+      </w:r>
+      <w:r>
+        <w:tab/>
+        <w:t>Primary</w:t>
+      </w:r>
+      <w:r>
+        <w:t xml:space="preserve"> Component Analysis</w:t>
+      </w:r>
+    </w:p>
+    <w:p>
+      <w:pPr>
+        <w:spacing w:line="240" w:lineRule="auto"/>
+      </w:pPr>
+      <w:r>
+        <w:t>PC1</w:t>
+      </w:r>
+      <w:r>
+        <w:tab/>
+      </w:r>
+      <w:r>
+        <w:tab/>
+        <w:t>Primary Component 1</w:t>
+      </w:r>
+    </w:p>
+    <w:p>
+      <w:pPr>
+        <w:spacing w:line="240" w:lineRule="auto"/>
+      </w:pPr>
+      <w:r>
+        <w:t>PC2</w:t>
+      </w:r>
+      <w:r>
+        <w:tab/>
+      </w:r>
+      <w:r>
+        <w:tab/>
+        <w:t>Primary Compone</w:t>
+      </w:r>
+      <w:r>
+        <w:t>nt 2</w:t>
       </w:r>
     </w:p>
     <w:p>
@@ -1804,7 +1974,7 @@
       <w:pPr>
         <w:pStyle w:val="Heading1"/>
       </w:pPr>
-      <w:bookmarkStart w:id="1" w:name="_Toc201418043"/>
+      <w:bookmarkStart w:id="1" w:name="_Toc201605759"/>
       <w:r>
         <w:lastRenderedPageBreak/>
         <w:t>Executive Summary</w:t>
@@ -1812,14 +1982,6 @@
       <w:bookmarkEnd w:id="1"/>
     </w:p>
     <w:p>
-      <w:pPr>
-        <w:rPr>
-          <w:rFonts w:eastAsiaTheme="majorEastAsia" w:cstheme="majorBidi"/>
-          <w:b/>
-          <w:sz w:val="32"/>
-          <w:szCs w:val="32"/>
-        </w:rPr>
-      </w:pPr>
       <w:r>
         <w:tab/>
       </w:r>
@@ -1848,29 +2010,43 @@
         <w:t xml:space="preserve">can better implement other software for drilling optimization. This combination will make </w:t>
       </w:r>
       <w:r>
-        <w:t xml:space="preserve">oil rig work more cost effective, time efficient, and safe for workers. </w:t>
-      </w:r>
-      <w:r>
-        <w:t xml:space="preserve">The methods slated for development, in order of priority, are </w:t>
-      </w:r>
-      <w:r>
-        <w:t>Hidden Markov Model (HMM), Gaussian Mixture Model (GMM), and Hierarchy Density-Based Spatial Clustering of Applications with Noise (HDBSCAN)</w:t>
-      </w:r>
-      <w:r>
-        <w:t>.</w:t>
-      </w:r>
-      <w:r>
-        <w:t xml:space="preserve"> The two clustering methods will </w:t>
-      </w:r>
-      <w:r>
-        <w:t>be implemented as a Random Forest (RF)</w:t>
-      </w:r>
-      <w:r>
-        <w:t xml:space="preserve"> for real-time identification</w:t>
-      </w:r>
-      <w:r>
-        <w:t>.</w:t>
-      </w:r>
+        <w:t>oil rig work more cost effective, time efficient, and safe for workers.</w:t>
+      </w:r>
+      <w:r>
+        <w:t xml:space="preserve"> A</w:t>
+      </w:r>
+      <w:r>
+        <w:t xml:space="preserve">n </w:t>
+      </w:r>
+      <w:r>
+        <w:t>optimally fitted</w:t>
+      </w:r>
+      <w:r>
+        <w:t xml:space="preserve"> Hidden Markov Model was defined by seven states and </w:t>
+      </w:r>
+      <w:r>
+        <w:t xml:space="preserve">using only WOB time-series data. </w:t>
+      </w:r>
+      <w:r>
+        <w:t>Unfortunately, this model was not interpretable and therefore cannot be</w:t>
+      </w:r>
+      <w:r>
+        <w:t xml:space="preserve"> used in real-world applications. </w:t>
+      </w:r>
+      <w:r>
+        <w:t xml:space="preserve">Therefore, future work on this project should consider </w:t>
+      </w:r>
+      <w:r>
+        <w:t xml:space="preserve">Gaussian Mixture Model (GMM) clustering, or gathering accurately labeled data and skipping straight to </w:t>
+      </w:r>
+      <w:r>
+        <w:t>designing a Random Forest (RF) that may be implemented directly in the client’s software.</w:t>
+      </w:r>
+    </w:p>
+    <w:p>
+      <w:pPr>
+        <w:spacing w:line="259" w:lineRule="auto"/>
+      </w:pPr>
       <w:r>
         <w:br w:type="page"/>
       </w:r>
@@ -1879,7 +2055,7 @@
       <w:pPr>
         <w:pStyle w:val="Heading1"/>
       </w:pPr>
-      <w:bookmarkStart w:id="2" w:name="_Toc201418044"/>
+      <w:bookmarkStart w:id="2" w:name="_Toc201605760"/>
       <w:r>
         <w:lastRenderedPageBreak/>
         <w:t>Introduction</w:t>
@@ -1936,7 +2112,15 @@
         <w:t xml:space="preserve"> from the last drilling state. The drilling state machine can only move</w:t>
       </w:r>
       <w:r>
-        <w:t xml:space="preserve"> consecutively with the exception of (1) providing access to (2) and (3), but (2) </w:t>
+        <w:t xml:space="preserve"> consecutively </w:t>
+      </w:r>
+      <w:proofErr w:type="gramStart"/>
+      <w:r>
+        <w:t>with the exception of</w:t>
+      </w:r>
+      <w:proofErr w:type="gramEnd"/>
+      <w:r>
+        <w:t xml:space="preserve"> (1) providing access to (2) and (3), but (2) </w:t>
       </w:r>
       <w:r>
         <w:t>not providing access to (3) (see Figure 1)</w:t>
@@ -1946,14 +2130,6 @@
       </w:r>
       <w:r>
         <w:t>.</w:t>
-      </w:r>
-    </w:p>
-    <w:p>
-      <w:pPr>
-        <w:ind w:firstLine="720"/>
-      </w:pPr>
-      <w:r>
-        <w:t>There are no existing solutions for this specific problem, but similar work has used the same drilling parameters to predict geological formations and torque on the drill string. Therefore, this project aims to expand on the methods previously used for classification in real time and shift their focus towards better understanding the drilling itself.</w:t>
       </w:r>
     </w:p>
     <w:tbl>
@@ -2530,14 +2706,30 @@
       </w:r>
       <w:r>
         <w:lastRenderedPageBreak/>
-        <w:t>training data (Jurafsky and Martin, 2024). This is particularly well suited for this project as we already have a Markov chain, namely the prepared drilling state machine.</w:t>
+        <w:t>training data (</w:t>
+      </w:r>
+      <w:proofErr w:type="spellStart"/>
+      <w:r>
+        <w:t>Jurafsky</w:t>
+      </w:r>
+      <w:proofErr w:type="spellEnd"/>
+      <w:r>
+        <w:t xml:space="preserve"> and Martin, 2024). This is particularly well suited for this project as we already have a Markov chain, namely the prepared </w:t>
+      </w:r>
+      <w:proofErr w:type="gramStart"/>
+      <w:r>
+        <w:t>drilling state</w:t>
+      </w:r>
+      <w:proofErr w:type="gramEnd"/>
+      <w:r>
+        <w:t xml:space="preserve"> machine.</w:t>
       </w:r>
     </w:p>
     <w:p>
       <w:pPr>
         <w:pStyle w:val="Heading1"/>
       </w:pPr>
-      <w:bookmarkStart w:id="3" w:name="_Toc201418045"/>
+      <w:bookmarkStart w:id="3" w:name="_Toc201605761"/>
       <w:r>
         <w:t>Related Work</w:t>
       </w:r>
@@ -2637,8 +2829,13 @@
       <w:r>
         <w:t xml:space="preserve">research topics, both within the oil and gas industry and outside of it. For instance, </w:t>
       </w:r>
-      <w:r>
-        <w:t xml:space="preserve">Tashnizi </w:t>
+      <w:proofErr w:type="spellStart"/>
+      <w:r>
+        <w:t>Tashnizi</w:t>
+      </w:r>
+      <w:proofErr w:type="spellEnd"/>
+      <w:r>
+        <w:t xml:space="preserve"> </w:t>
       </w:r>
       <w:r>
         <w:t xml:space="preserve">(2022) </w:t>
@@ -2662,7 +2859,15 @@
         <w:t>cluster sets larger than four</w:t>
       </w:r>
       <w:r>
-        <w:t xml:space="preserve"> (Tashnizi, 2022, p. </w:t>
+        <w:t xml:space="preserve"> (</w:t>
+      </w:r>
+      <w:proofErr w:type="spellStart"/>
+      <w:r>
+        <w:t>Tashnizi</w:t>
+      </w:r>
+      <w:proofErr w:type="spellEnd"/>
+      <w:r>
+        <w:t xml:space="preserve">, 2022, p. </w:t>
       </w:r>
       <w:r>
         <w:t>67).</w:t>
@@ -2705,7 +2910,7 @@
       <w:pPr>
         <w:pStyle w:val="Heading1"/>
       </w:pPr>
-      <w:bookmarkStart w:id="4" w:name="_Toc201418046"/>
+      <w:bookmarkStart w:id="4" w:name="_Toc201605762"/>
       <w:r>
         <w:t>Methodology</w:t>
       </w:r>
@@ -2715,7 +2920,7 @@
       <w:pPr>
         <w:pStyle w:val="Heading2"/>
       </w:pPr>
-      <w:bookmarkStart w:id="5" w:name="_Toc201418047"/>
+      <w:bookmarkStart w:id="5" w:name="_Toc201605763"/>
       <w:r>
         <w:t>Datasets</w:t>
       </w:r>
@@ -2735,10 +2940,34 @@
         <w:t xml:space="preserve"> runs from three different oil rigs</w:t>
       </w:r>
       <w:r>
-        <w:t xml:space="preserve">, named Flybar </w:t>
-      </w:r>
-      <w:r>
-        <w:t>1WB, Flybar 1WC, and Flybar 2WC</w:t>
+        <w:t xml:space="preserve">, named </w:t>
+      </w:r>
+      <w:proofErr w:type="spellStart"/>
+      <w:r>
+        <w:t>Flybar</w:t>
+      </w:r>
+      <w:proofErr w:type="spellEnd"/>
+      <w:r>
+        <w:t xml:space="preserve"> </w:t>
+      </w:r>
+      <w:r>
+        <w:t xml:space="preserve">1WB, </w:t>
+      </w:r>
+      <w:proofErr w:type="spellStart"/>
+      <w:r>
+        <w:t>Flybar</w:t>
+      </w:r>
+      <w:proofErr w:type="spellEnd"/>
+      <w:r>
+        <w:t xml:space="preserve"> 1WC, and </w:t>
+      </w:r>
+      <w:proofErr w:type="spellStart"/>
+      <w:r>
+        <w:t>Flybar</w:t>
+      </w:r>
+      <w:proofErr w:type="spellEnd"/>
+      <w:r>
+        <w:t xml:space="preserve"> 2WC</w:t>
       </w:r>
       <w:r>
         <w:t xml:space="preserve">. </w:t>
@@ -2872,9 +3101,11 @@
               <w:jc w:val="center"/>
               <w:cnfStyle w:val="000000100000" w:firstRow="0" w:lastRow="0" w:firstColumn="0" w:lastColumn="0" w:oddVBand="0" w:evenVBand="0" w:oddHBand="1" w:evenHBand="0" w:firstRowFirstColumn="0" w:firstRowLastColumn="0" w:lastRowFirstColumn="0" w:lastRowLastColumn="0"/>
             </w:pPr>
+            <w:proofErr w:type="spellStart"/>
             <w:r>
               <w:t>RT_Time</w:t>
             </w:r>
+            <w:proofErr w:type="spellEnd"/>
           </w:p>
         </w:tc>
         <w:tc>
@@ -2933,9 +3164,11 @@
               <w:jc w:val="center"/>
               <w:cnfStyle w:val="000000000000" w:firstRow="0" w:lastRow="0" w:firstColumn="0" w:lastColumn="0" w:oddVBand="0" w:evenVBand="0" w:oddHBand="0" w:evenHBand="0" w:firstRowFirstColumn="0" w:firstRowLastColumn="0" w:lastRowFirstColumn="0" w:lastRowLastColumn="0"/>
             </w:pPr>
+            <w:proofErr w:type="spellStart"/>
             <w:r>
               <w:t>RT_Depth</w:t>
             </w:r>
+            <w:proofErr w:type="spellEnd"/>
           </w:p>
         </w:tc>
         <w:tc>
@@ -3000,9 +3233,11 @@
               <w:spacing w:line="240" w:lineRule="auto"/>
               <w:cnfStyle w:val="000000100000" w:firstRow="0" w:lastRow="0" w:firstColumn="0" w:lastColumn="0" w:oddVBand="0" w:evenVBand="0" w:oddHBand="1" w:evenHBand="0" w:firstRowFirstColumn="0" w:firstRowLastColumn="0" w:lastRowFirstColumn="0" w:lastRowLastColumn="0"/>
             </w:pPr>
+            <w:proofErr w:type="spellStart"/>
             <w:r>
               <w:t>RT_Pumps_Off</w:t>
             </w:r>
+            <w:proofErr w:type="spellEnd"/>
           </w:p>
           <w:p>
             <w:pPr>
@@ -3014,9 +3249,11 @@
               <w:spacing w:line="240" w:lineRule="auto"/>
               <w:cnfStyle w:val="000000100000" w:firstRow="0" w:lastRow="0" w:firstColumn="0" w:lastColumn="0" w:oddVBand="0" w:evenVBand="0" w:oddHBand="1" w:evenHBand="0" w:firstRowFirstColumn="0" w:firstRowLastColumn="0" w:lastRowFirstColumn="0" w:lastRowLastColumn="0"/>
             </w:pPr>
+            <w:proofErr w:type="spellStart"/>
             <w:r>
               <w:t>RT_Pumps_On</w:t>
             </w:r>
+            <w:proofErr w:type="spellEnd"/>
           </w:p>
         </w:tc>
         <w:tc>
@@ -3094,9 +3331,11 @@
               <w:jc w:val="center"/>
               <w:cnfStyle w:val="000000000000" w:firstRow="0" w:lastRow="0" w:firstColumn="0" w:lastColumn="0" w:oddVBand="0" w:evenVBand="0" w:oddHBand="0" w:evenHBand="0" w:firstRowFirstColumn="0" w:firstRowLastColumn="0" w:lastRowFirstColumn="0" w:lastRowLastColumn="0"/>
             </w:pPr>
+            <w:proofErr w:type="spellStart"/>
             <w:r>
               <w:t>Motor_RPM</w:t>
             </w:r>
+            <w:proofErr w:type="spellEnd"/>
           </w:p>
         </w:tc>
         <w:tc>
@@ -3162,8 +3401,21 @@
               <w:spacing w:line="240" w:lineRule="auto"/>
               <w:cnfStyle w:val="000000100000" w:firstRow="0" w:lastRow="0" w:firstColumn="0" w:lastColumn="0" w:oddVBand="0" w:evenVBand="0" w:oddHBand="1" w:evenHBand="0" w:firstRowFirstColumn="0" w:firstRowLastColumn="0" w:lastRowFirstColumn="0" w:lastRowLastColumn="0"/>
             </w:pPr>
-            <w:r>
-              <w:t>PD_Axial Vibration, PD_Lateral Vibration</w:t>
+            <w:proofErr w:type="spellStart"/>
+            <w:r>
+              <w:t>PD_Axial</w:t>
+            </w:r>
+            <w:proofErr w:type="spellEnd"/>
+            <w:r>
+              <w:t xml:space="preserve"> Vibration, </w:t>
+            </w:r>
+            <w:proofErr w:type="spellStart"/>
+            <w:r>
+              <w:t>PD_Lateral</w:t>
+            </w:r>
+            <w:proofErr w:type="spellEnd"/>
+            <w:r>
+              <w:t xml:space="preserve"> Vibration</w:t>
             </w:r>
           </w:p>
         </w:tc>
@@ -3181,9 +3433,11 @@
               <w:spacing w:line="240" w:lineRule="auto"/>
               <w:cnfStyle w:val="000000100000" w:firstRow="0" w:lastRow="0" w:firstColumn="0" w:lastColumn="0" w:oddVBand="0" w:evenVBand="0" w:oddHBand="1" w:evenHBand="0" w:firstRowFirstColumn="0" w:firstRowLastColumn="0" w:lastRowFirstColumn="0" w:lastRowLastColumn="0"/>
             </w:pPr>
+            <w:proofErr w:type="spellStart"/>
             <w:r>
               <w:t>Motor_Axial_Vibration</w:t>
             </w:r>
+            <w:proofErr w:type="spellEnd"/>
           </w:p>
           <w:p>
             <w:pPr>
@@ -3195,9 +3449,11 @@
               <w:spacing w:line="240" w:lineRule="auto"/>
               <w:cnfStyle w:val="000000100000" w:firstRow="0" w:lastRow="0" w:firstColumn="0" w:lastColumn="0" w:oddVBand="0" w:evenVBand="0" w:oddHBand="1" w:evenHBand="0" w:firstRowFirstColumn="0" w:firstRowLastColumn="0" w:lastRowFirstColumn="0" w:lastRowLastColumn="0"/>
             </w:pPr>
+            <w:proofErr w:type="spellStart"/>
             <w:r>
               <w:t>Motor_Lateral_Vibration</w:t>
             </w:r>
+            <w:proofErr w:type="spellEnd"/>
           </w:p>
           <w:p>
             <w:pPr>
@@ -3209,9 +3465,11 @@
               <w:spacing w:line="240" w:lineRule="auto"/>
               <w:cnfStyle w:val="000000100000" w:firstRow="0" w:lastRow="0" w:firstColumn="0" w:lastColumn="0" w:oddVBand="0" w:evenVBand="0" w:oddHBand="1" w:evenHBand="0" w:firstRowFirstColumn="0" w:firstRowLastColumn="0" w:lastRowFirstColumn="0" w:lastRowLastColumn="0"/>
             </w:pPr>
+            <w:proofErr w:type="spellStart"/>
             <w:r>
               <w:t>Pulser_Axial_Vibration</w:t>
             </w:r>
+            <w:proofErr w:type="spellEnd"/>
           </w:p>
           <w:p>
             <w:pPr>
@@ -3223,9 +3481,11 @@
               <w:spacing w:line="240" w:lineRule="auto"/>
               <w:cnfStyle w:val="000000100000" w:firstRow="0" w:lastRow="0" w:firstColumn="0" w:lastColumn="0" w:oddVBand="0" w:evenVBand="0" w:oddHBand="1" w:evenHBand="0" w:firstRowFirstColumn="0" w:firstRowLastColumn="0" w:lastRowFirstColumn="0" w:lastRowLastColumn="0"/>
             </w:pPr>
+            <w:proofErr w:type="spellStart"/>
             <w:r>
               <w:t>Pulser_Lateral_Vibration</w:t>
             </w:r>
+            <w:proofErr w:type="spellEnd"/>
           </w:p>
         </w:tc>
         <w:tc>
@@ -3317,7 +3577,7 @@
       <w:pPr>
         <w:pStyle w:val="Heading2"/>
       </w:pPr>
-      <w:bookmarkStart w:id="6" w:name="_Toc201418048"/>
+      <w:bookmarkStart w:id="6" w:name="_Toc201605764"/>
       <w:r>
         <w:lastRenderedPageBreak/>
         <w:t>Preprocessing</w:t>
@@ -3394,9 +3654,9 @@
     </w:p>
     <w:p>
       <w:pPr>
-        <w:pStyle w:val="Heading3"/>
-      </w:pPr>
-      <w:bookmarkStart w:id="7" w:name="_Toc201418049"/>
+        <w:pStyle w:val="Heading2"/>
+      </w:pPr>
+      <w:bookmarkStart w:id="7" w:name="_Toc201605765"/>
       <w:r>
         <w:t>Warehousing</w:t>
       </w:r>
@@ -3427,7 +3687,7 @@
       <w:pPr>
         <w:pStyle w:val="Heading2"/>
       </w:pPr>
-      <w:bookmarkStart w:id="8" w:name="_Toc201418050"/>
+      <w:bookmarkStart w:id="8" w:name="_Toc201605766"/>
       <w:r>
         <w:t>Modeling</w:t>
       </w:r>
@@ -3443,11 +3703,16 @@
       <w:r>
         <w:t xml:space="preserve">module from the </w:t>
       </w:r>
+      <w:proofErr w:type="spellStart"/>
       <w:r>
         <w:t>hmml</w:t>
       </w:r>
       <w:r>
-        <w:t xml:space="preserve">earn package, which is supported by </w:t>
+        <w:t>earn</w:t>
+      </w:r>
+      <w:proofErr w:type="spellEnd"/>
+      <w:r>
+        <w:t xml:space="preserve"> package, which is supported by </w:t>
       </w:r>
       <w:r>
         <w:t>s</w:t>
@@ -3537,7 +3802,31 @@
         </w:numPr>
       </w:pPr>
       <w:r>
-        <w:t>Motor Reliance: [GPM, Motor_RPM, Motor_Axial_Vibration, Motor_Lateral_Vibration, WOB]</w:t>
+        <w:t xml:space="preserve">Motor Reliance: [GPM, </w:t>
+      </w:r>
+      <w:proofErr w:type="spellStart"/>
+      <w:r>
+        <w:t>Motor_RPM</w:t>
+      </w:r>
+      <w:proofErr w:type="spellEnd"/>
+      <w:r>
+        <w:t xml:space="preserve">, </w:t>
+      </w:r>
+      <w:proofErr w:type="spellStart"/>
+      <w:r>
+        <w:t>Motor_Axial_Vibration</w:t>
+      </w:r>
+      <w:proofErr w:type="spellEnd"/>
+      <w:r>
+        <w:t xml:space="preserve">, </w:t>
+      </w:r>
+      <w:proofErr w:type="spellStart"/>
+      <w:r>
+        <w:t>Motor_Lateral_Vibration</w:t>
+      </w:r>
+      <w:proofErr w:type="spellEnd"/>
+      <w:r>
+        <w:t>, WOB]</w:t>
       </w:r>
     </w:p>
     <w:p>
@@ -3549,7 +3838,31 @@
         </w:numPr>
       </w:pPr>
       <w:r>
-        <w:t>Pulser Reliance: [GPM, Motor_RPM, Pulser_Axial_Vibration, Pulser_Lateral_Vibration, WOB]</w:t>
+        <w:t xml:space="preserve">Pulser Reliance: [GPM, </w:t>
+      </w:r>
+      <w:proofErr w:type="spellStart"/>
+      <w:r>
+        <w:t>Motor_RPM</w:t>
+      </w:r>
+      <w:proofErr w:type="spellEnd"/>
+      <w:r>
+        <w:t xml:space="preserve">, </w:t>
+      </w:r>
+      <w:proofErr w:type="spellStart"/>
+      <w:r>
+        <w:t>Pulser_Axial_Vibration</w:t>
+      </w:r>
+      <w:proofErr w:type="spellEnd"/>
+      <w:r>
+        <w:t xml:space="preserve">, </w:t>
+      </w:r>
+      <w:proofErr w:type="spellStart"/>
+      <w:r>
+        <w:t>Pulser_Lateral_Vibration</w:t>
+      </w:r>
+      <w:proofErr w:type="spellEnd"/>
+      <w:r>
+        <w:t>, WOB]</w:t>
       </w:r>
     </w:p>
     <w:p>
@@ -3562,7 +3875,39 @@
       </w:pPr>
       <w:r>
         <w:lastRenderedPageBreak/>
-        <w:t>All Vibration: [Motor_Axial_Vibration, Motor_Lateral_Vibration, Pulser_Axial_Vibration, Pulser_Lateral_Vibration]</w:t>
+        <w:t>All Vibration: [</w:t>
+      </w:r>
+      <w:proofErr w:type="spellStart"/>
+      <w:r>
+        <w:t>Motor_Axial_Vibration</w:t>
+      </w:r>
+      <w:proofErr w:type="spellEnd"/>
+      <w:r>
+        <w:t xml:space="preserve">, </w:t>
+      </w:r>
+      <w:proofErr w:type="spellStart"/>
+      <w:r>
+        <w:t>Motor_Lateral_Vibration</w:t>
+      </w:r>
+      <w:proofErr w:type="spellEnd"/>
+      <w:r>
+        <w:t xml:space="preserve">, </w:t>
+      </w:r>
+      <w:proofErr w:type="spellStart"/>
+      <w:r>
+        <w:t>Pulser_Axial_Vibration</w:t>
+      </w:r>
+      <w:proofErr w:type="spellEnd"/>
+      <w:r>
+        <w:t xml:space="preserve">, </w:t>
+      </w:r>
+      <w:proofErr w:type="spellStart"/>
+      <w:r>
+        <w:t>Pulser_Lateral_Vibration</w:t>
+      </w:r>
+      <w:proofErr w:type="spellEnd"/>
+      <w:r>
+        <w:t>]</w:t>
       </w:r>
     </w:p>
     <w:p>
@@ -3580,7 +3925,23 @@
         <w:t>r</w:t>
       </w:r>
       <w:r>
-        <w:t>: [Motor_Axial_Vibration, Motor_Lateral_Vibration]</w:t>
+        <w:t>: [</w:t>
+      </w:r>
+      <w:proofErr w:type="spellStart"/>
+      <w:r>
+        <w:t>Motor_Axial_Vibration</w:t>
+      </w:r>
+      <w:proofErr w:type="spellEnd"/>
+      <w:r>
+        <w:t xml:space="preserve">, </w:t>
+      </w:r>
+      <w:proofErr w:type="spellStart"/>
+      <w:r>
+        <w:t>Motor_Lateral_Vibration</w:t>
+      </w:r>
+      <w:proofErr w:type="spellEnd"/>
+      <w:r>
+        <w:t>]</w:t>
       </w:r>
     </w:p>
     <w:p>
@@ -3592,7 +3953,23 @@
         </w:numPr>
       </w:pPr>
       <w:r>
-        <w:t>Just Pulser: [Pulser_Axial_Vibration, Pulser_Lateral_Vibration]</w:t>
+        <w:t>Just Pulser: [</w:t>
+      </w:r>
+      <w:proofErr w:type="spellStart"/>
+      <w:r>
+        <w:t>Pulser_Axial_Vibration</w:t>
+      </w:r>
+      <w:proofErr w:type="spellEnd"/>
+      <w:r>
+        <w:t xml:space="preserve">, </w:t>
+      </w:r>
+      <w:proofErr w:type="spellStart"/>
+      <w:r>
+        <w:t>Pulser_Lateral_Vibration</w:t>
+      </w:r>
+      <w:proofErr w:type="spellEnd"/>
+      <w:r>
+        <w:t>]</w:t>
       </w:r>
     </w:p>
     <w:p>
@@ -3600,7 +3977,15 @@
         <w:ind w:firstLine="720"/>
       </w:pPr>
       <w:r>
-        <w:t xml:space="preserve">It was important to include a sufficient number of random seeds to initialize the </w:t>
+        <w:t xml:space="preserve">It was important to include </w:t>
+      </w:r>
+      <w:proofErr w:type="gramStart"/>
+      <w:r>
+        <w:t>a sufficient number of</w:t>
+      </w:r>
+      <w:proofErr w:type="gramEnd"/>
+      <w:r>
+        <w:t xml:space="preserve"> random seeds to initialize the </w:t>
       </w:r>
       <w:r>
         <w:t xml:space="preserve">model such that a sufficient seed was found without too much bias to begin. </w:t>
@@ -3609,7 +3994,21 @@
         <w:t xml:space="preserve">The number of states was tested to see if there were models that would be better at modeling the data. </w:t>
       </w:r>
       <w:r>
-        <w:t xml:space="preserve">Finally, the features from the original dataset that was included in the training and testing for a particular model was changed to see which combination would produce more accurate and less complicated models. </w:t>
+        <w:t>Finally, the features from the original dataset that w</w:t>
+      </w:r>
+      <w:r>
+        <w:t>ere</w:t>
+      </w:r>
+      <w:r>
+        <w:t xml:space="preserve"> included in the training and testing for a particular model </w:t>
+      </w:r>
+      <w:proofErr w:type="gramStart"/>
+      <w:r>
+        <w:t>was</w:t>
+      </w:r>
+      <w:proofErr w:type="gramEnd"/>
+      <w:r>
+        <w:t xml:space="preserve"> changed to see which combination would produce more accurate and less complicated models. </w:t>
       </w:r>
       <w:r>
         <w:t xml:space="preserve">The client suggested that vibration might be the most </w:t>
@@ -3655,10 +4054,31 @@
     </w:p>
     <w:p>
       <w:pPr>
+        <w:ind w:firstLine="720"/>
+      </w:pPr>
+      <w:r>
+        <w:t xml:space="preserve">After testing these models, it became clear that a final variation might be worth considering. In this variation, the only feature given to the model was WOB. </w:t>
+      </w:r>
+      <w:r>
+        <w:t xml:space="preserve">This was because of the primary role WOB plays in actively drilling compared to the other </w:t>
+      </w:r>
+      <w:r>
+        <w:t xml:space="preserve">activities that happen on a drilling rig that can be seen in the data recorded downhole. </w:t>
+      </w:r>
+      <w:r>
+        <w:t xml:space="preserve">This final variation was considered due to the client’s primary goal of identifying when drilling was occurring </w:t>
+      </w:r>
+      <w:r>
+        <w:t>so their software could turn off and on as appropriate.</w:t>
+      </w:r>
+    </w:p>
+    <w:p>
+      <w:pPr>
         <w:pStyle w:val="Heading2"/>
       </w:pPr>
-      <w:bookmarkStart w:id="9" w:name="_Toc201418051"/>
-      <w:r>
+      <w:bookmarkStart w:id="9" w:name="_Toc201605767"/>
+      <w:r>
+        <w:lastRenderedPageBreak/>
         <w:t>Evaluation</w:t>
       </w:r>
       <w:bookmarkEnd w:id="9"/>
@@ -3668,1010 +4088,852 @@
         <w:tab/>
       </w:r>
       <w:r>
-        <w:t>This project will utilize the data from Flybar 1WB and Flybar 1WC to train</w:t>
+        <w:t>This project utilize</w:t>
+      </w:r>
+      <w:r>
+        <w:t>d</w:t>
+      </w:r>
+      <w:r>
+        <w:t xml:space="preserve"> the data from </w:t>
+      </w:r>
+      <w:proofErr w:type="spellStart"/>
+      <w:r>
+        <w:t>Flybar</w:t>
+      </w:r>
+      <w:proofErr w:type="spellEnd"/>
+      <w:r>
+        <w:t xml:space="preserve"> 1WB and </w:t>
+      </w:r>
+      <w:proofErr w:type="spellStart"/>
+      <w:r>
+        <w:t>Flybar</w:t>
+      </w:r>
+      <w:proofErr w:type="spellEnd"/>
+      <w:r>
+        <w:t xml:space="preserve"> 1WC to train</w:t>
       </w:r>
       <w:r>
         <w:t xml:space="preserve"> the three methods</w:t>
       </w:r>
       <w:r>
-        <w:t>. These methods will then be tested on the singular, but lengthy, run conducted on Flybar 2WC.</w:t>
+        <w:t xml:space="preserve">. These methods </w:t>
+      </w:r>
+      <w:r>
+        <w:t>were</w:t>
+      </w:r>
+      <w:r>
+        <w:t xml:space="preserve"> tested on the singular, but lengthy, run conducted on </w:t>
+      </w:r>
+      <w:proofErr w:type="spellStart"/>
+      <w:r>
+        <w:t>Flybar</w:t>
+      </w:r>
+      <w:proofErr w:type="spellEnd"/>
+      <w:r>
+        <w:t xml:space="preserve"> 2WC.</w:t>
       </w:r>
       <w:r>
         <w:t xml:space="preserve"> </w:t>
       </w:r>
       <w:r>
-        <w:t xml:space="preserve">The </w:t>
-      </w:r>
-      <w:r>
-        <w:t>clustering methods will be evaluated with the silhouette coefficient</w:t>
-      </w:r>
-      <w:r>
-        <w:t xml:space="preserve"> and Davies-Bouldin Index. The HMM will be </w:t>
-      </w:r>
-      <w:r>
-        <w:t xml:space="preserve">evaluated in a similar manner. All three methods will also undergo </w:t>
-      </w:r>
-      <w:r>
-        <w:t xml:space="preserve">a manual inspection that uses domain knowledge to determine how accurate the state </w:t>
-      </w:r>
+        <w:t>The</w:t>
+      </w:r>
+      <w:r>
+        <w:t xml:space="preserve"> log likelihood of the models </w:t>
+      </w:r>
+      <w:r>
+        <w:t>was used to represent which ones best fit the testing data, the AIC and BIC were used to determine the complexity of the models, and then a</w:t>
+      </w:r>
+      <w:r>
+        <w:t xml:space="preserve"> visual analysis of the four identified drilling parameters</w:t>
+      </w:r>
+      <w:r>
+        <w:t xml:space="preserve"> (flow, rotation, vibration, and WOB)</w:t>
+      </w:r>
+      <w:r>
+        <w:t xml:space="preserve"> was completed to assess the interpretability of the models’ states</w:t>
+      </w:r>
+      <w:r>
+        <w:t>.</w:t>
+      </w:r>
+    </w:p>
+    <w:p>
+      <w:pPr>
+        <w:pStyle w:val="Heading1"/>
+      </w:pPr>
+      <w:bookmarkStart w:id="10" w:name="_Toc201605768"/>
+      <w:r>
+        <w:t>Results</w:t>
+      </w:r>
+      <w:bookmarkEnd w:id="10"/>
+    </w:p>
+    <w:p>
+      <w:pPr>
+        <w:ind w:firstLine="720"/>
+      </w:pPr>
+      <w:r>
+        <w:t>O</w:t>
+      </w:r>
+      <w:r>
+        <w:t xml:space="preserve">ver 700 models </w:t>
+      </w:r>
+      <w:r>
+        <w:t xml:space="preserve">provided a wide variety of results. </w:t>
+      </w:r>
+      <w:r>
+        <w:t xml:space="preserve">The top fifteen models in terms of log likelihood </w:t>
+      </w:r>
+      <w:r>
+        <w:t xml:space="preserve">were </w:t>
+      </w:r>
+      <w:r>
+        <w:t>significantly better than the other models created.</w:t>
+      </w:r>
+      <w:r>
+        <w:t xml:space="preserve"> </w:t>
+      </w:r>
+      <w:r>
+        <w:t xml:space="preserve">Two feature sets outperformed the rest: WOB and </w:t>
+      </w:r>
+      <w:r>
+        <w:t>Just Pulser, meaning data frames including only the axial and lateral vibrations measured at the pulser</w:t>
+      </w:r>
+      <w:r>
+        <w:t xml:space="preserve"> </w:t>
+      </w:r>
+      <w:r>
+        <w:t>(Figure 2)</w:t>
+      </w:r>
+      <w:r>
+        <w:t>.</w:t>
+      </w:r>
+      <w:r>
+        <w:t xml:space="preserve"> Considering the domain knowledge used in choosing these parameters for basing the models on, it is not surprising that this was the case.</w:t>
+      </w:r>
+    </w:p>
+    <w:p>
+      <w:pPr>
+        <w:keepNext/>
+        <w:jc w:val="center"/>
+      </w:pPr>
+      <w:r>
+        <w:rPr>
+          <w:noProof/>
+          <w14:ligatures w14:val="standardContextual"/>
+        </w:rPr>
+        <w:drawing>
+          <wp:inline distT="0" distB="0" distL="0" distR="0" wp14:anchorId="40528BA8" wp14:editId="61569F25">
+            <wp:extent cx="3759200" cy="2819400"/>
+            <wp:effectExtent l="0" t="0" r="0" b="0"/>
+            <wp:docPr id="1285683527" name="Picture 3" descr="A graph with blue and orange dots&#10;&#10;AI-generated content may be incorrect."/>
+            <wp:cNvGraphicFramePr>
+              <a:graphicFrameLocks xmlns:a="http://schemas.openxmlformats.org/drawingml/2006/main" noChangeAspect="1"/>
+            </wp:cNvGraphicFramePr>
+            <a:graphic xmlns:a="http://schemas.openxmlformats.org/drawingml/2006/main">
+              <a:graphicData uri="http://schemas.openxmlformats.org/drawingml/2006/picture">
+                <pic:pic xmlns:pic="http://schemas.openxmlformats.org/drawingml/2006/picture">
+                  <pic:nvPicPr>
+                    <pic:cNvPr id="1285683527" name="Picture 3" descr="A graph with blue and orange dots&#10;&#10;AI-generated content may be incorrect."/>
+                    <pic:cNvPicPr/>
+                  </pic:nvPicPr>
+                  <pic:blipFill>
+                    <a:blip r:embed="rId9">
+                      <a:extLst>
+                        <a:ext uri="{28A0092B-C50C-407E-A947-70E740481C1C}">
+                          <a14:useLocalDpi xmlns:a14="http://schemas.microsoft.com/office/drawing/2010/main" val="0"/>
+                        </a:ext>
+                      </a:extLst>
+                    </a:blip>
+                    <a:stretch>
+                      <a:fillRect/>
+                    </a:stretch>
+                  </pic:blipFill>
+                  <pic:spPr>
+                    <a:xfrm>
+                      <a:off x="0" y="0"/>
+                      <a:ext cx="3770997" cy="2828248"/>
+                    </a:xfrm>
+                    <a:prstGeom prst="rect">
+                      <a:avLst/>
+                    </a:prstGeom>
+                  </pic:spPr>
+                </pic:pic>
+              </a:graphicData>
+            </a:graphic>
+          </wp:inline>
+        </w:drawing>
+      </w:r>
+    </w:p>
+    <w:p>
+      <w:pPr>
+        <w:pStyle w:val="Caption"/>
+        <w:jc w:val="center"/>
+      </w:pPr>
+      <w:r>
+        <w:t xml:space="preserve">Figure </w:t>
+      </w:r>
+      <w:fldSimple w:instr=" SEQ Figure \* ARABIC ">
+        <w:r>
+          <w:rPr>
+            <w:noProof/>
+          </w:rPr>
+          <w:t>2</w:t>
+        </w:r>
+      </w:fldSimple>
+      <w:r>
+        <w:t>. Top 15 HMMs with the highest log likelihoods</w:t>
+      </w:r>
+    </w:p>
+    <w:p>
       <w:r>
         <w:lastRenderedPageBreak/>
-        <w:t xml:space="preserve">labels are. Finally, the RF will be evaluated through </w:t>
-      </w:r>
-      <w:r>
-        <w:t>testing on data clustered by the original method that was used in training the RF.</w:t>
+        <w:tab/>
+        <w:t xml:space="preserve">Furthermore, complexity </w:t>
+      </w:r>
+      <w:r>
+        <w:t>is linearly</w:t>
+      </w:r>
+      <w:r>
+        <w:t xml:space="preserve"> scaled with the number of states in the model.</w:t>
+      </w:r>
+      <w:r>
+        <w:t xml:space="preserve"> </w:t>
+      </w:r>
+      <w:r>
+        <w:t xml:space="preserve">The AIC for the top fifteen models identified above can be seen below (Figure 3). The </w:t>
+      </w:r>
+      <w:r>
+        <w:t xml:space="preserve">graph for BIC looks almost identical. </w:t>
+      </w:r>
+    </w:p>
+    <w:p>
+      <w:pPr>
+        <w:keepNext/>
+        <w:jc w:val="center"/>
+      </w:pPr>
+      <w:r>
+        <w:rPr>
+          <w:noProof/>
+          <w14:ligatures w14:val="standardContextual"/>
+        </w:rPr>
+        <w:drawing>
+          <wp:inline distT="0" distB="0" distL="0" distR="0" wp14:anchorId="31C16301" wp14:editId="5D953F06">
+            <wp:extent cx="3793067" cy="2844800"/>
+            <wp:effectExtent l="0" t="0" r="0" b="0"/>
+            <wp:docPr id="468234129" name="Picture 4" descr="A graph with blue and orange dots&#10;&#10;AI-generated content may be incorrect."/>
+            <wp:cNvGraphicFramePr>
+              <a:graphicFrameLocks xmlns:a="http://schemas.openxmlformats.org/drawingml/2006/main" noChangeAspect="1"/>
+            </wp:cNvGraphicFramePr>
+            <a:graphic xmlns:a="http://schemas.openxmlformats.org/drawingml/2006/main">
+              <a:graphicData uri="http://schemas.openxmlformats.org/drawingml/2006/picture">
+                <pic:pic xmlns:pic="http://schemas.openxmlformats.org/drawingml/2006/picture">
+                  <pic:nvPicPr>
+                    <pic:cNvPr id="468234129" name="Picture 4" descr="A graph with blue and orange dots&#10;&#10;AI-generated content may be incorrect."/>
+                    <pic:cNvPicPr/>
+                  </pic:nvPicPr>
+                  <pic:blipFill>
+                    <a:blip r:embed="rId10">
+                      <a:extLst>
+                        <a:ext uri="{28A0092B-C50C-407E-A947-70E740481C1C}">
+                          <a14:useLocalDpi xmlns:a14="http://schemas.microsoft.com/office/drawing/2010/main" val="0"/>
+                        </a:ext>
+                      </a:extLst>
+                    </a:blip>
+                    <a:stretch>
+                      <a:fillRect/>
+                    </a:stretch>
+                  </pic:blipFill>
+                  <pic:spPr>
+                    <a:xfrm>
+                      <a:off x="0" y="0"/>
+                      <a:ext cx="3797303" cy="2847977"/>
+                    </a:xfrm>
+                    <a:prstGeom prst="rect">
+                      <a:avLst/>
+                    </a:prstGeom>
+                  </pic:spPr>
+                </pic:pic>
+              </a:graphicData>
+            </a:graphic>
+          </wp:inline>
+        </w:drawing>
+      </w:r>
+    </w:p>
+    <w:p>
+      <w:pPr>
+        <w:pStyle w:val="Caption"/>
+        <w:jc w:val="center"/>
+      </w:pPr>
+      <w:r>
+        <w:t xml:space="preserve">Figure </w:t>
+      </w:r>
+      <w:fldSimple w:instr=" SEQ Figure \* ARABIC ">
+        <w:r>
+          <w:rPr>
+            <w:noProof/>
+          </w:rPr>
+          <w:t>3</w:t>
+        </w:r>
+      </w:fldSimple>
+      <w:r>
+        <w:t>. Complexity of the top 15 HMMs visualized with the AIC</w:t>
+      </w:r>
+    </w:p>
+    <w:p>
+      <w:r>
+        <w:tab/>
+        <w:t xml:space="preserve">With </w:t>
+      </w:r>
+      <w:proofErr w:type="gramStart"/>
+      <w:r>
+        <w:t>both of these</w:t>
+      </w:r>
+      <w:proofErr w:type="gramEnd"/>
+      <w:r>
+        <w:t xml:space="preserve"> parameters in mind, the </w:t>
+      </w:r>
+      <w:r>
+        <w:t xml:space="preserve">most effective models tested include the </w:t>
+      </w:r>
+      <w:r>
+        <w:t xml:space="preserve">WOB-based models with 7 and 10 states. Keep in mind that </w:t>
+      </w:r>
+      <w:r>
+        <w:t>the WOB models were not tested for more than ten states, unlike the other feature sets due to the increasing difficulty in interpretability</w:t>
+      </w:r>
+      <w:r>
+        <w:t>. Additionally, the WOB models were only tested with the random seed of 2021</w:t>
+      </w:r>
+      <w:r>
+        <w:t xml:space="preserve"> in the interest of time.</w:t>
       </w:r>
     </w:p>
     <w:p>
       <w:pPr>
         <w:pStyle w:val="Heading1"/>
       </w:pPr>
-      <w:bookmarkStart w:id="10" w:name="_Toc201418052"/>
+      <w:bookmarkStart w:id="11" w:name="_Toc201605769"/>
       <w:r>
         <w:t>Discussion</w:t>
       </w:r>
-      <w:bookmarkEnd w:id="10"/>
+      <w:bookmarkEnd w:id="11"/>
     </w:p>
     <w:p>
       <w:r>
         <w:tab/>
-      </w:r>
-      <w:r>
-        <w:t>T</w:t>
-      </w:r>
-      <w:r>
-        <w:t xml:space="preserve">he project is </w:t>
-      </w:r>
-      <w:r>
-        <w:t xml:space="preserve">currently </w:t>
-      </w:r>
-      <w:r>
-        <w:t>in the</w:t>
+        <w:t xml:space="preserve">To better understand the </w:t>
+      </w:r>
+      <w:r>
+        <w:t xml:space="preserve">7- and 10-State WOB models, </w:t>
+      </w:r>
+      <w:r>
+        <w:t>Primary Component Analysis (PCA)</w:t>
+      </w:r>
+      <w:r>
+        <w:t xml:space="preserve"> was conducted</w:t>
+      </w:r>
+      <w:r>
+        <w:t xml:space="preserve"> and the features for each state were compared.</w:t>
+      </w:r>
+      <w:r>
+        <w:t xml:space="preserve"> The features included in this analysis were GPM (flow), RPM (rotation), </w:t>
+      </w:r>
+      <w:r>
+        <w:t xml:space="preserve">axial and lateral vibration, and WOB. Note that the vibration data came from the pulser rather than the motor because it is closer to the bit and </w:t>
+      </w:r>
+      <w:r>
+        <w:lastRenderedPageBreak/>
+        <w:t>was more effective for model building (Figure 2).</w:t>
+      </w:r>
+      <w:r>
+        <w:t xml:space="preserve"> For the purposes of this paper and to reduce redundancy, only the 7-State WOB Model will be represented here. This is due to the </w:t>
+      </w:r>
+      <w:r>
+        <w:t xml:space="preserve">extreme similarities between the findings of each model and the easier visualization and interpretability of the </w:t>
+      </w:r>
+      <w:r>
+        <w:t>7-state model over the 10-state model.</w:t>
+      </w:r>
+    </w:p>
+    <w:p>
+      <w:r>
+        <w:tab/>
+        <w:t>The</w:t>
+      </w:r>
+      <w:r>
+        <w:t xml:space="preserve"> labeled</w:t>
       </w:r>
       <w:r>
         <w:t xml:space="preserve"> </w:t>
       </w:r>
       <w:r>
-        <w:t>modeling stage</w:t>
-      </w:r>
-      <w:r>
-        <w:t xml:space="preserve">. </w:t>
-      </w:r>
-      <w:r>
-        <w:t>Understanding the data had already been completed before this project was initiated</w:t>
-      </w:r>
-      <w:r>
-        <w:t xml:space="preserve">. </w:t>
-      </w:r>
-      <w:r>
-        <w:t xml:space="preserve">With the data now preprocessed and stored in an accessible format, </w:t>
-      </w:r>
-      <w:r>
-        <w:t>the bulk of the remaining time will be spent on modeling</w:t>
-      </w:r>
-      <w:r>
-        <w:t xml:space="preserve">. </w:t>
+        <w:t>testing data for the 7-State WOB Model was reduced</w:t>
+      </w:r>
+      <w:r>
+        <w:t xml:space="preserve"> to two dimensions using P</w:t>
+      </w:r>
+      <w:r>
+        <w:t>CA an</w:t>
+      </w:r>
+      <w:r>
+        <w:t>d</w:t>
+      </w:r>
+      <w:r>
+        <w:t xml:space="preserve"> </w:t>
+      </w:r>
+      <w:r>
+        <w:t>the loadings for each feature were</w:t>
+      </w:r>
+      <w:r>
+        <w:t xml:space="preserve"> </w:t>
+      </w:r>
+      <w:r>
+        <w:t xml:space="preserve">found. </w:t>
+      </w:r>
+      <w:r>
+        <w:t>PC</w:t>
+      </w:r>
+      <w:r>
+        <w:t xml:space="preserve">1 explains </w:t>
+      </w:r>
+      <w:r>
+        <w:t>approximately 32% of the variance in the data and PC2 explains about 24% of the variance in the data. Together</w:t>
+      </w:r>
+      <w:r>
+        <w:t>,</w:t>
+      </w:r>
+      <w:r>
+        <w:t xml:space="preserve"> they explain about half of the data’s variance. </w:t>
+      </w:r>
+      <w:r>
+        <w:t xml:space="preserve">The layout of the clusters for </w:t>
+      </w:r>
+      <w:r>
+        <w:t>each state and their PC values is seen in Figure 4.</w:t>
+      </w:r>
+      <w:r>
+        <w:t xml:space="preserve"> While it would have been more satisfactory to see </w:t>
+      </w:r>
+      <w:r>
+        <w:t>a higher percentage of the variance explained by the first two components, a</w:t>
+      </w:r>
+      <w:r>
+        <w:t>n analysis with more dimensions seemed unnecessary since there were only five features to begin with.</w:t>
+      </w:r>
+    </w:p>
+    <w:p>
+      <w:pPr>
+        <w:keepNext/>
+        <w:jc w:val="center"/>
+      </w:pPr>
+      <w:r>
+        <w:rPr>
+          <w:noProof/>
+          <w14:ligatures w14:val="standardContextual"/>
+        </w:rPr>
+        <w:drawing>
+          <wp:inline distT="0" distB="0" distL="0" distR="0" wp14:anchorId="3A140133" wp14:editId="0B53AC45">
+            <wp:extent cx="5071533" cy="3042920"/>
+            <wp:effectExtent l="0" t="0" r="0" b="5080"/>
+            <wp:docPr id="882081167" name="Picture 6" descr="A diagram of a graph&#10;&#10;AI-generated content may be incorrect."/>
+            <wp:cNvGraphicFramePr>
+              <a:graphicFrameLocks xmlns:a="http://schemas.openxmlformats.org/drawingml/2006/main" noChangeAspect="1"/>
+            </wp:cNvGraphicFramePr>
+            <a:graphic xmlns:a="http://schemas.openxmlformats.org/drawingml/2006/main">
+              <a:graphicData uri="http://schemas.openxmlformats.org/drawingml/2006/picture">
+                <pic:pic xmlns:pic="http://schemas.openxmlformats.org/drawingml/2006/picture">
+                  <pic:nvPicPr>
+                    <pic:cNvPr id="882081167" name="Picture 6" descr="A diagram of a graph&#10;&#10;AI-generated content may be incorrect."/>
+                    <pic:cNvPicPr/>
+                  </pic:nvPicPr>
+                  <pic:blipFill>
+                    <a:blip r:embed="rId11">
+                      <a:extLst>
+                        <a:ext uri="{28A0092B-C50C-407E-A947-70E740481C1C}">
+                          <a14:useLocalDpi xmlns:a14="http://schemas.microsoft.com/office/drawing/2010/main" val="0"/>
+                        </a:ext>
+                      </a:extLst>
+                    </a:blip>
+                    <a:stretch>
+                      <a:fillRect/>
+                    </a:stretch>
+                  </pic:blipFill>
+                  <pic:spPr>
+                    <a:xfrm>
+                      <a:off x="0" y="0"/>
+                      <a:ext cx="5076171" cy="3045703"/>
+                    </a:xfrm>
+                    <a:prstGeom prst="rect">
+                      <a:avLst/>
+                    </a:prstGeom>
+                  </pic:spPr>
+                </pic:pic>
+              </a:graphicData>
+            </a:graphic>
+          </wp:inline>
+        </w:drawing>
+      </w:r>
+    </w:p>
+    <w:p>
+      <w:pPr>
+        <w:pStyle w:val="Caption"/>
+        <w:jc w:val="center"/>
+      </w:pPr>
+      <w:r>
+        <w:t xml:space="preserve">Figure </w:t>
+      </w:r>
+      <w:fldSimple w:instr=" SEQ Figure \* ARABIC ">
+        <w:r>
+          <w:rPr>
+            <w:noProof/>
+          </w:rPr>
+          <w:t>4</w:t>
+        </w:r>
+      </w:fldSimple>
+      <w:r>
+        <w:t>. PCA of 7-State WOB Model</w:t>
+      </w:r>
+      <w:r>
+        <w:t xml:space="preserve"> (5% of data points represented)</w:t>
+      </w:r>
+    </w:p>
+    <w:p>
+      <w:r>
+        <w:tab/>
+        <w:t xml:space="preserve">The most influential </w:t>
+      </w:r>
+      <w:r>
+        <w:t xml:space="preserve">features in defining these two principal components were the WOB, </w:t>
+      </w:r>
+      <w:r>
+        <w:t xml:space="preserve">Axial Vibration, </w:t>
+      </w:r>
+      <w:r>
+        <w:t>RPM</w:t>
+      </w:r>
+      <w:r>
+        <w:t xml:space="preserve"> (Figure 5)</w:t>
+      </w:r>
+      <w:r>
+        <w:t xml:space="preserve">. RPM is mentioned here over Lateral Vibration despite the </w:t>
+      </w:r>
+      <w:r>
+        <w:lastRenderedPageBreak/>
+        <w:t xml:space="preserve">latter’s </w:t>
+      </w:r>
+      <w:r>
+        <w:t>primary role in PC1 due to the</w:t>
+      </w:r>
+      <w:r>
+        <w:t xml:space="preserve"> higher</w:t>
+      </w:r>
+      <w:r>
+        <w:t xml:space="preserve"> aggregated effect of RPM</w:t>
+      </w:r>
+      <w:r>
+        <w:t xml:space="preserve">. It also alleviates some of the concern about axial and lateral vibrations’ </w:t>
+      </w:r>
+      <w:r>
+        <w:t xml:space="preserve">interconnectedness in a closer manner than any other two features. It is no surprise that WOB </w:t>
+      </w:r>
+      <w:r>
+        <w:t xml:space="preserve">was a key contributor to the separation of the data since the model was built on this feature. However, the roles of </w:t>
+      </w:r>
+      <w:r>
+        <w:t>axial vibration and RPM require further investigation.</w:t>
+      </w:r>
+    </w:p>
+    <w:p>
+      <w:pPr>
+        <w:keepNext/>
+        <w:jc w:val="center"/>
+      </w:pPr>
+      <w:r>
+        <w:rPr>
+          <w:noProof/>
+          <w14:ligatures w14:val="standardContextual"/>
+        </w:rPr>
+        <w:drawing>
+          <wp:inline distT="0" distB="0" distL="0" distR="0" wp14:anchorId="644F46F8" wp14:editId="341D93E9">
+            <wp:extent cx="5943600" cy="1485900"/>
+            <wp:effectExtent l="0" t="0" r="0" b="0"/>
+            <wp:docPr id="1315342771" name="Picture 5" descr="A bar chart with multiple colored bars&#10;&#10;AI-generated content may be incorrect."/>
+            <wp:cNvGraphicFramePr>
+              <a:graphicFrameLocks xmlns:a="http://schemas.openxmlformats.org/drawingml/2006/main" noChangeAspect="1"/>
+            </wp:cNvGraphicFramePr>
+            <a:graphic xmlns:a="http://schemas.openxmlformats.org/drawingml/2006/main">
+              <a:graphicData uri="http://schemas.openxmlformats.org/drawingml/2006/picture">
+                <pic:pic xmlns:pic="http://schemas.openxmlformats.org/drawingml/2006/picture">
+                  <pic:nvPicPr>
+                    <pic:cNvPr id="1315342771" name="Picture 5" descr="A bar chart with multiple colored bars&#10;&#10;AI-generated content may be incorrect."/>
+                    <pic:cNvPicPr/>
+                  </pic:nvPicPr>
+                  <pic:blipFill>
+                    <a:blip r:embed="rId12">
+                      <a:extLst>
+                        <a:ext uri="{28A0092B-C50C-407E-A947-70E740481C1C}">
+                          <a14:useLocalDpi xmlns:a14="http://schemas.microsoft.com/office/drawing/2010/main" val="0"/>
+                        </a:ext>
+                      </a:extLst>
+                    </a:blip>
+                    <a:stretch>
+                      <a:fillRect/>
+                    </a:stretch>
+                  </pic:blipFill>
+                  <pic:spPr>
+                    <a:xfrm>
+                      <a:off x="0" y="0"/>
+                      <a:ext cx="5943600" cy="1485900"/>
+                    </a:xfrm>
+                    <a:prstGeom prst="rect">
+                      <a:avLst/>
+                    </a:prstGeom>
+                  </pic:spPr>
+                </pic:pic>
+              </a:graphicData>
+            </a:graphic>
+          </wp:inline>
+        </w:drawing>
+      </w:r>
+    </w:p>
+    <w:p>
+      <w:pPr>
+        <w:pStyle w:val="Caption"/>
+        <w:jc w:val="center"/>
+        <w:rPr>
+          <w:noProof/>
+        </w:rPr>
+      </w:pPr>
+      <w:r>
+        <w:t xml:space="preserve">Figure </w:t>
+      </w:r>
+      <w:fldSimple w:instr=" SEQ Figure \* ARABIC ">
+        <w:r>
+          <w:rPr>
+            <w:noProof/>
+          </w:rPr>
+          <w:t>5</w:t>
+        </w:r>
+      </w:fldSimple>
+      <w:r>
+        <w:t>. Loadings of features for primary components of 7</w:t>
+      </w:r>
+      <w:r>
+        <w:rPr>
+          <w:noProof/>
+        </w:rPr>
+        <w:t>-State WOB Model</w:t>
+      </w:r>
+    </w:p>
+    <w:p>
+      <w:pPr>
+        <w:keepNext/>
+        <w:jc w:val="center"/>
+      </w:pPr>
+      <w:r>
+        <w:rPr>
+          <w:noProof/>
+          <w14:ligatures w14:val="standardContextual"/>
+        </w:rPr>
+        <w:drawing>
+          <wp:inline distT="0" distB="0" distL="0" distR="0" wp14:anchorId="7FA332A1" wp14:editId="41A6D3A5">
+            <wp:extent cx="5994400" cy="3020616"/>
+            <wp:effectExtent l="0" t="0" r="6350" b="8890"/>
+            <wp:docPr id="250540777" name="Picture 7" descr="A collage of multiple colored lines&#10;&#10;AI-generated content may be incorrect."/>
+            <wp:cNvGraphicFramePr>
+              <a:graphicFrameLocks xmlns:a="http://schemas.openxmlformats.org/drawingml/2006/main" noChangeAspect="1"/>
+            </wp:cNvGraphicFramePr>
+            <a:graphic xmlns:a="http://schemas.openxmlformats.org/drawingml/2006/main">
+              <a:graphicData uri="http://schemas.openxmlformats.org/drawingml/2006/picture">
+                <pic:pic xmlns:pic="http://schemas.openxmlformats.org/drawingml/2006/picture">
+                  <pic:nvPicPr>
+                    <pic:cNvPr id="250540777" name="Picture 7" descr="A collage of multiple colored lines&#10;&#10;AI-generated content may be incorrect."/>
+                    <pic:cNvPicPr/>
+                  </pic:nvPicPr>
+                  <pic:blipFill>
+                    <a:blip r:embed="rId13" cstate="print">
+                      <a:extLst>
+                        <a:ext uri="{28A0092B-C50C-407E-A947-70E740481C1C}">
+                          <a14:useLocalDpi xmlns:a14="http://schemas.microsoft.com/office/drawing/2010/main" val="0"/>
+                        </a:ext>
+                      </a:extLst>
+                    </a:blip>
+                    <a:stretch>
+                      <a:fillRect/>
+                    </a:stretch>
+                  </pic:blipFill>
+                  <pic:spPr>
+                    <a:xfrm>
+                      <a:off x="0" y="0"/>
+                      <a:ext cx="6007089" cy="3027010"/>
+                    </a:xfrm>
+                    <a:prstGeom prst="rect">
+                      <a:avLst/>
+                    </a:prstGeom>
+                  </pic:spPr>
+                </pic:pic>
+              </a:graphicData>
+            </a:graphic>
+          </wp:inline>
+        </w:drawing>
+      </w:r>
+    </w:p>
+    <w:p>
+      <w:pPr>
+        <w:pStyle w:val="Caption"/>
+        <w:jc w:val="center"/>
+      </w:pPr>
+      <w:r>
+        <w:t xml:space="preserve">Figure </w:t>
+      </w:r>
+      <w:fldSimple w:instr=" SEQ Figure \* ARABIC ">
+        <w:r>
+          <w:rPr>
+            <w:noProof/>
+          </w:rPr>
+          <w:t>6</w:t>
+        </w:r>
+      </w:fldSimple>
+      <w:r>
+        <w:t>. Feature comparison for 7-State WOB Model</w:t>
+      </w:r>
+      <w:r>
+        <w:t xml:space="preserve"> with color</w:t>
+      </w:r>
+      <w:r>
+        <w:t>-coded states (5% of data points represented)</w:t>
+      </w:r>
+    </w:p>
+    <w:p>
+      <w:r>
+        <w:tab/>
+        <w:t xml:space="preserve">A visualization of the state clusters with a comparison of each of the features was created </w:t>
+      </w:r>
+      <w:proofErr w:type="gramStart"/>
+      <w:r>
+        <w:t>in order to</w:t>
+      </w:r>
+      <w:proofErr w:type="gramEnd"/>
+      <w:r>
+        <w:t xml:space="preserve"> better understand their roles in defining the states (Figure 6). The findings from this </w:t>
+      </w:r>
+      <w:r>
+        <w:lastRenderedPageBreak/>
+        <w:t xml:space="preserve">were rather inconclusive. </w:t>
       </w:r>
       <w:r>
         <w:t>A</w:t>
       </w:r>
       <w:r>
-        <w:t xml:space="preserve"> rough</w:t>
-      </w:r>
-      <w:r>
-        <w:t xml:space="preserve"> timeline for the rest of the project is below.</w:t>
-      </w:r>
-    </w:p>
-    <w:p>
-      <w:pPr>
-        <w:ind w:firstLine="720"/>
-      </w:pPr>
-      <w:r>
-        <w:t xml:space="preserve">The most significant challenge for this project is the condensed timeline. Should the scope of the project prove to be too large for the given time, the </w:t>
-      </w:r>
-      <w:r>
-        <w:t>clustering</w:t>
+        <w:t>t first glance,</w:t>
+      </w:r>
+      <w:r>
+        <w:t xml:space="preserve"> state-based patterns seem to emerge, espe</w:t>
+      </w:r>
+      <w:r>
+        <w:t xml:space="preserve">cially on </w:t>
+      </w:r>
+      <w:proofErr w:type="gramStart"/>
+      <w:r>
+        <w:t>the WOB</w:t>
+      </w:r>
+      <w:proofErr w:type="gramEnd"/>
+      <w:r>
+        <w:t xml:space="preserve"> comparisons. However, a closer look reveals that the clusters are only based on WOB with no </w:t>
+      </w:r>
+      <w:r>
+        <w:t>patterns relating to the second feature in the comparison.</w:t>
+      </w:r>
+    </w:p>
+    <w:p>
+      <w:pPr>
+        <w:pStyle w:val="Heading1"/>
+      </w:pPr>
+      <w:bookmarkStart w:id="12" w:name="_Toc201605770"/>
+      <w:r>
+        <w:t>Conclusion</w:t>
+      </w:r>
+      <w:bookmarkEnd w:id="12"/>
+    </w:p>
+    <w:p>
+      <w:r>
+        <w:tab/>
+      </w:r>
+      <w:r>
+        <w:t xml:space="preserve">The current implementation of the Hidden Markov Model was unsuccessful at identifying </w:t>
+      </w:r>
+      <w:r>
+        <w:t>interpretable states that can be used for MWD software development</w:t>
+      </w:r>
+      <w:r>
+        <w:t>.</w:t>
       </w:r>
       <w:r>
         <w:t xml:space="preserve"> </w:t>
       </w:r>
       <w:r>
-        <w:t xml:space="preserve">methods </w:t>
-      </w:r>
-      <w:r>
-        <w:t xml:space="preserve">will be eliminated and the </w:t>
-      </w:r>
-      <w:r>
-        <w:t>HMM</w:t>
-      </w:r>
-      <w:r>
-        <w:t xml:space="preserve"> will be evaluated without </w:t>
-      </w:r>
-      <w:r>
-        <w:t>comparisons to traditional clustering</w:t>
-      </w:r>
-      <w:r>
-        <w:t xml:space="preserve">. </w:t>
+        <w:t xml:space="preserve">Because the states were not clustering around trends </w:t>
+      </w:r>
+      <w:r>
+        <w:t>that would be expected for normal drilling activity changes and the subsequent parameter shifts, it is likely that the data was too sparse and the forward filling in the preprocessing obfuscated the</w:t>
+      </w:r>
+      <w:r>
+        <w:t xml:space="preserve"> true parameter patterns. </w:t>
+      </w:r>
+      <w:r>
+        <w:t>Furthermore, a methodology with a higher level of interpretation is necessary to avoid</w:t>
+      </w:r>
+      <w:r>
+        <w:t xml:space="preserve"> the current result of highly suited models with no real-world application. </w:t>
+      </w:r>
+    </w:p>
+    <w:p>
+      <w:r>
+        <w:tab/>
+        <w:t xml:space="preserve">Future work on this project </w:t>
+      </w:r>
+      <w:r>
+        <w:t xml:space="preserve">should investigate Gaussian Mixture Models (GMM) for clustering if no data with labels can be obtained. </w:t>
       </w:r>
       <w:r>
         <w:t xml:space="preserve">Furthermore, </w:t>
       </w:r>
       <w:r>
-        <w:t>the project may be able to gather clustering results from either GMM or HDBSCAN, or both</w:t>
-      </w:r>
-      <w:r>
-        <w:t>.</w:t>
-      </w:r>
-      <w:r>
-        <w:t xml:space="preserve"> In this case, only the RF implementation and testing may be eliminated. </w:t>
-      </w:r>
-      <w:r>
-        <w:t>At this time, there are no other challenges of significance anticipated.</w:t>
-      </w:r>
+        <w:t xml:space="preserve">it would be worth looking into </w:t>
+      </w:r>
+      <w:r>
+        <w:t xml:space="preserve">gathering accurately labeled data </w:t>
+      </w:r>
+      <w:proofErr w:type="gramStart"/>
+      <w:r>
+        <w:t>in order to</w:t>
+      </w:r>
+      <w:proofErr w:type="gramEnd"/>
       <w:r>
         <w:t xml:space="preserve"> </w:t>
       </w:r>
       <w:r>
-        <w:t>Although</w:t>
-      </w:r>
-      <w:r>
-        <w:t xml:space="preserve"> this was stated </w:t>
-      </w:r>
-      <w:r>
-        <w:t>previously,</w:t>
-      </w:r>
-      <w:r>
-        <w:t xml:space="preserve"> the labeling data was found to be </w:t>
-      </w:r>
-      <w:r>
-        <w:t>mute.</w:t>
-      </w:r>
-    </w:p>
-    <w:tbl>
-      <w:tblPr>
-        <w:tblStyle w:val="PlainTable3"/>
-        <w:tblW w:w="0" w:type="auto"/>
-        <w:tblLook w:val="04A0" w:firstRow="1" w:lastRow="0" w:firstColumn="1" w:lastColumn="0" w:noHBand="0" w:noVBand="1"/>
-      </w:tblPr>
-      <w:tblGrid>
-        <w:gridCol w:w="2337"/>
-        <w:gridCol w:w="2337"/>
-        <w:gridCol w:w="2338"/>
-        <w:gridCol w:w="2338"/>
-      </w:tblGrid>
-      <w:tr>
-        <w:trPr>
-          <w:cnfStyle w:val="100000000000" w:firstRow="1" w:lastRow="0" w:firstColumn="0" w:lastColumn="0" w:oddVBand="0" w:evenVBand="0" w:oddHBand="0" w:evenHBand="0" w:firstRowFirstColumn="0" w:firstRowLastColumn="0" w:lastRowFirstColumn="0" w:lastRowLastColumn="0"/>
-        </w:trPr>
-        <w:tc>
-          <w:tcPr>
-            <w:cnfStyle w:val="001000000100" w:firstRow="0" w:lastRow="0" w:firstColumn="1" w:lastColumn="0" w:oddVBand="0" w:evenVBand="0" w:oddHBand="0" w:evenHBand="0" w:firstRowFirstColumn="1" w:firstRowLastColumn="0" w:lastRowFirstColumn="0" w:lastRowLastColumn="0"/>
-            <w:tcW w:w="2337" w:type="dxa"/>
-          </w:tcPr>
-          <w:p>
-            <w:pPr>
-              <w:spacing w:line="240" w:lineRule="auto"/>
-            </w:pPr>
-            <w:r>
-              <w:t>Date</w:t>
-            </w:r>
-          </w:p>
-        </w:tc>
-        <w:tc>
-          <w:tcPr>
-            <w:tcW w:w="2337" w:type="dxa"/>
-          </w:tcPr>
-          <w:p>
-            <w:pPr>
-              <w:spacing w:line="240" w:lineRule="auto"/>
-              <w:cnfStyle w:val="100000000000" w:firstRow="1" w:lastRow="0" w:firstColumn="0" w:lastColumn="0" w:oddVBand="0" w:evenVBand="0" w:oddHBand="0" w:evenHBand="0" w:firstRowFirstColumn="0" w:firstRowLastColumn="0" w:lastRowFirstColumn="0" w:lastRowLastColumn="0"/>
-            </w:pPr>
-            <w:r>
-              <w:t>Assignment Due</w:t>
-            </w:r>
-          </w:p>
-        </w:tc>
-        <w:tc>
-          <w:tcPr>
-            <w:tcW w:w="2338" w:type="dxa"/>
-          </w:tcPr>
-          <w:p>
-            <w:pPr>
-              <w:spacing w:line="240" w:lineRule="auto"/>
-              <w:cnfStyle w:val="100000000000" w:firstRow="1" w:lastRow="0" w:firstColumn="0" w:lastColumn="0" w:oddVBand="0" w:evenVBand="0" w:oddHBand="0" w:evenHBand="0" w:firstRowFirstColumn="0" w:firstRowLastColumn="0" w:lastRowFirstColumn="0" w:lastRowLastColumn="0"/>
-            </w:pPr>
-            <w:r>
-              <w:t>Assignment tasks</w:t>
-            </w:r>
-          </w:p>
-        </w:tc>
-        <w:tc>
-          <w:tcPr>
-            <w:tcW w:w="2338" w:type="dxa"/>
-          </w:tcPr>
-          <w:p>
-            <w:pPr>
-              <w:spacing w:line="240" w:lineRule="auto"/>
-              <w:cnfStyle w:val="100000000000" w:firstRow="1" w:lastRow="0" w:firstColumn="0" w:lastColumn="0" w:oddVBand="0" w:evenVBand="0" w:oddHBand="0" w:evenHBand="0" w:firstRowFirstColumn="0" w:firstRowLastColumn="0" w:lastRowFirstColumn="0" w:lastRowLastColumn="0"/>
-            </w:pPr>
-            <w:r>
-              <w:t>Research Tasks</w:t>
-            </w:r>
-          </w:p>
-        </w:tc>
-      </w:tr>
-      <w:tr>
-        <w:trPr>
-          <w:cnfStyle w:val="000000100000" w:firstRow="0" w:lastRow="0" w:firstColumn="0" w:lastColumn="0" w:oddVBand="0" w:evenVBand="0" w:oddHBand="1" w:evenHBand="0" w:firstRowFirstColumn="0" w:firstRowLastColumn="0" w:lastRowFirstColumn="0" w:lastRowLastColumn="0"/>
-        </w:trPr>
-        <w:tc>
-          <w:tcPr>
-            <w:cnfStyle w:val="001000000000" w:firstRow="0" w:lastRow="0" w:firstColumn="1" w:lastColumn="0" w:oddVBand="0" w:evenVBand="0" w:oddHBand="0" w:evenHBand="0" w:firstRowFirstColumn="0" w:firstRowLastColumn="0" w:lastRowFirstColumn="0" w:lastRowLastColumn="0"/>
-            <w:tcW w:w="2337" w:type="dxa"/>
-          </w:tcPr>
-          <w:p>
-            <w:pPr>
-              <w:spacing w:line="276" w:lineRule="auto"/>
-              <w:rPr>
-                <w:b w:val="0"/>
-                <w:bCs w:val="0"/>
-                <w:caps w:val="0"/>
-              </w:rPr>
-            </w:pPr>
-            <w:r>
-              <w:t>June 12</w:t>
-            </w:r>
-          </w:p>
-        </w:tc>
-        <w:tc>
-          <w:tcPr>
-            <w:tcW w:w="2337" w:type="dxa"/>
-          </w:tcPr>
-          <w:p>
-            <w:pPr>
-              <w:spacing w:line="276" w:lineRule="auto"/>
-              <w:cnfStyle w:val="000000100000" w:firstRow="0" w:lastRow="0" w:firstColumn="0" w:lastColumn="0" w:oddVBand="0" w:evenVBand="0" w:oddHBand="1" w:evenHBand="0" w:firstRowFirstColumn="0" w:firstRowLastColumn="0" w:lastRowFirstColumn="0" w:lastRowLastColumn="0"/>
-            </w:pPr>
-          </w:p>
-        </w:tc>
-        <w:tc>
-          <w:tcPr>
-            <w:tcW w:w="2338" w:type="dxa"/>
-          </w:tcPr>
-          <w:p>
-            <w:pPr>
-              <w:spacing w:line="276" w:lineRule="auto"/>
-              <w:cnfStyle w:val="000000100000" w:firstRow="0" w:lastRow="0" w:firstColumn="0" w:lastColumn="0" w:oddVBand="0" w:evenVBand="0" w:oddHBand="1" w:evenHBand="0" w:firstRowFirstColumn="0" w:firstRowLastColumn="0" w:lastRowFirstColumn="0" w:lastRowLastColumn="0"/>
-            </w:pPr>
-          </w:p>
-        </w:tc>
-        <w:tc>
-          <w:tcPr>
-            <w:tcW w:w="2338" w:type="dxa"/>
-          </w:tcPr>
-          <w:p>
-            <w:pPr>
-              <w:spacing w:line="276" w:lineRule="auto"/>
-              <w:cnfStyle w:val="000000100000" w:firstRow="0" w:lastRow="0" w:firstColumn="0" w:lastColumn="0" w:oddVBand="0" w:evenVBand="0" w:oddHBand="1" w:evenHBand="0" w:firstRowFirstColumn="0" w:firstRowLastColumn="0" w:lastRowFirstColumn="0" w:lastRowLastColumn="0"/>
-            </w:pPr>
-            <w:r>
-              <w:t xml:space="preserve">HMM </w:t>
-            </w:r>
-            <w:r>
-              <w:t>T</w:t>
-            </w:r>
-            <w:r>
-              <w:t>raining</w:t>
-            </w:r>
-          </w:p>
-        </w:tc>
-      </w:tr>
-      <w:tr>
-        <w:tc>
-          <w:tcPr>
-            <w:cnfStyle w:val="001000000000" w:firstRow="0" w:lastRow="0" w:firstColumn="1" w:lastColumn="0" w:oddVBand="0" w:evenVBand="0" w:oddHBand="0" w:evenHBand="0" w:firstRowFirstColumn="0" w:firstRowLastColumn="0" w:lastRowFirstColumn="0" w:lastRowLastColumn="0"/>
-            <w:tcW w:w="2337" w:type="dxa"/>
-          </w:tcPr>
-          <w:p>
-            <w:pPr>
-              <w:spacing w:line="276" w:lineRule="auto"/>
-            </w:pPr>
-            <w:r>
-              <w:t>June 13</w:t>
-            </w:r>
-          </w:p>
-        </w:tc>
-        <w:tc>
-          <w:tcPr>
-            <w:tcW w:w="2337" w:type="dxa"/>
-          </w:tcPr>
-          <w:p>
-            <w:pPr>
-              <w:spacing w:line="276" w:lineRule="auto"/>
-              <w:cnfStyle w:val="000000000000" w:firstRow="0" w:lastRow="0" w:firstColumn="0" w:lastColumn="0" w:oddVBand="0" w:evenVBand="0" w:oddHBand="0" w:evenHBand="0" w:firstRowFirstColumn="0" w:firstRowLastColumn="0" w:lastRowFirstColumn="0" w:lastRowLastColumn="0"/>
-            </w:pPr>
-          </w:p>
-        </w:tc>
-        <w:tc>
-          <w:tcPr>
-            <w:tcW w:w="2338" w:type="dxa"/>
-          </w:tcPr>
-          <w:p>
-            <w:pPr>
-              <w:spacing w:line="276" w:lineRule="auto"/>
-              <w:cnfStyle w:val="000000000000" w:firstRow="0" w:lastRow="0" w:firstColumn="0" w:lastColumn="0" w:oddVBand="0" w:evenVBand="0" w:oddHBand="0" w:evenHBand="0" w:firstRowFirstColumn="0" w:firstRowLastColumn="0" w:lastRowFirstColumn="0" w:lastRowLastColumn="0"/>
-            </w:pPr>
-          </w:p>
-        </w:tc>
-        <w:tc>
-          <w:tcPr>
-            <w:tcW w:w="2338" w:type="dxa"/>
-          </w:tcPr>
-          <w:p>
-            <w:pPr>
-              <w:spacing w:line="276" w:lineRule="auto"/>
-              <w:cnfStyle w:val="000000000000" w:firstRow="0" w:lastRow="0" w:firstColumn="0" w:lastColumn="0" w:oddVBand="0" w:evenVBand="0" w:oddHBand="0" w:evenHBand="0" w:firstRowFirstColumn="0" w:firstRowLastColumn="0" w:lastRowFirstColumn="0" w:lastRowLastColumn="0"/>
-            </w:pPr>
-            <w:r>
-              <w:t xml:space="preserve">HMM </w:t>
-            </w:r>
-            <w:r>
-              <w:t>T</w:t>
-            </w:r>
-            <w:r>
-              <w:t>esting</w:t>
-            </w:r>
-          </w:p>
-        </w:tc>
-      </w:tr>
-      <w:tr>
-        <w:trPr>
-          <w:cnfStyle w:val="000000100000" w:firstRow="0" w:lastRow="0" w:firstColumn="0" w:lastColumn="0" w:oddVBand="0" w:evenVBand="0" w:oddHBand="1" w:evenHBand="0" w:firstRowFirstColumn="0" w:firstRowLastColumn="0" w:lastRowFirstColumn="0" w:lastRowLastColumn="0"/>
-        </w:trPr>
-        <w:tc>
-          <w:tcPr>
-            <w:cnfStyle w:val="001000000000" w:firstRow="0" w:lastRow="0" w:firstColumn="1" w:lastColumn="0" w:oddVBand="0" w:evenVBand="0" w:oddHBand="0" w:evenHBand="0" w:firstRowFirstColumn="0" w:firstRowLastColumn="0" w:lastRowFirstColumn="0" w:lastRowLastColumn="0"/>
-            <w:tcW w:w="2337" w:type="dxa"/>
-          </w:tcPr>
-          <w:p>
-            <w:pPr>
-              <w:spacing w:line="276" w:lineRule="auto"/>
-            </w:pPr>
-            <w:r>
-              <w:t xml:space="preserve">June </w:t>
-            </w:r>
-            <w:r>
-              <w:t>16</w:t>
-            </w:r>
-          </w:p>
-        </w:tc>
-        <w:tc>
-          <w:tcPr>
-            <w:tcW w:w="2337" w:type="dxa"/>
-          </w:tcPr>
-          <w:p>
-            <w:pPr>
-              <w:spacing w:line="276" w:lineRule="auto"/>
-              <w:cnfStyle w:val="000000100000" w:firstRow="0" w:lastRow="0" w:firstColumn="0" w:lastColumn="0" w:oddVBand="0" w:evenVBand="0" w:oddHBand="1" w:evenHBand="0" w:firstRowFirstColumn="0" w:firstRowLastColumn="0" w:lastRowFirstColumn="0" w:lastRowLastColumn="0"/>
-            </w:pPr>
-          </w:p>
-        </w:tc>
-        <w:tc>
-          <w:tcPr>
-            <w:tcW w:w="2338" w:type="dxa"/>
-          </w:tcPr>
-          <w:p>
-            <w:pPr>
-              <w:spacing w:line="276" w:lineRule="auto"/>
-              <w:cnfStyle w:val="000000100000" w:firstRow="0" w:lastRow="0" w:firstColumn="0" w:lastColumn="0" w:oddVBand="0" w:evenVBand="0" w:oddHBand="1" w:evenHBand="0" w:firstRowFirstColumn="0" w:firstRowLastColumn="0" w:lastRowFirstColumn="0" w:lastRowLastColumn="0"/>
-            </w:pPr>
-          </w:p>
-        </w:tc>
-        <w:tc>
-          <w:tcPr>
-            <w:tcW w:w="2338" w:type="dxa"/>
-          </w:tcPr>
-          <w:p>
-            <w:pPr>
-              <w:spacing w:line="276" w:lineRule="auto"/>
-              <w:cnfStyle w:val="000000100000" w:firstRow="0" w:lastRow="0" w:firstColumn="0" w:lastColumn="0" w:oddVBand="0" w:evenVBand="0" w:oddHBand="1" w:evenHBand="0" w:firstRowFirstColumn="0" w:firstRowLastColumn="0" w:lastRowFirstColumn="0" w:lastRowLastColumn="0"/>
-            </w:pPr>
-            <w:r>
-              <w:t>UMAP Processing</w:t>
-            </w:r>
-          </w:p>
-        </w:tc>
-      </w:tr>
-      <w:tr>
-        <w:tc>
-          <w:tcPr>
-            <w:cnfStyle w:val="001000000000" w:firstRow="0" w:lastRow="0" w:firstColumn="1" w:lastColumn="0" w:oddVBand="0" w:evenVBand="0" w:oddHBand="0" w:evenHBand="0" w:firstRowFirstColumn="0" w:firstRowLastColumn="0" w:lastRowFirstColumn="0" w:lastRowLastColumn="0"/>
-            <w:tcW w:w="2337" w:type="dxa"/>
-          </w:tcPr>
-          <w:p>
-            <w:pPr>
-              <w:spacing w:line="276" w:lineRule="auto"/>
-            </w:pPr>
-            <w:r>
-              <w:t>June 17</w:t>
-            </w:r>
-          </w:p>
-        </w:tc>
-        <w:tc>
-          <w:tcPr>
-            <w:tcW w:w="2337" w:type="dxa"/>
-          </w:tcPr>
-          <w:p>
-            <w:pPr>
-              <w:spacing w:line="276" w:lineRule="auto"/>
-              <w:cnfStyle w:val="000000000000" w:firstRow="0" w:lastRow="0" w:firstColumn="0" w:lastColumn="0" w:oddVBand="0" w:evenVBand="0" w:oddHBand="0" w:evenHBand="0" w:firstRowFirstColumn="0" w:firstRowLastColumn="0" w:lastRowFirstColumn="0" w:lastRowLastColumn="0"/>
-            </w:pPr>
-          </w:p>
-        </w:tc>
-        <w:tc>
-          <w:tcPr>
-            <w:tcW w:w="2338" w:type="dxa"/>
-          </w:tcPr>
-          <w:p>
-            <w:pPr>
-              <w:spacing w:line="276" w:lineRule="auto"/>
-              <w:cnfStyle w:val="000000000000" w:firstRow="0" w:lastRow="0" w:firstColumn="0" w:lastColumn="0" w:oddVBand="0" w:evenVBand="0" w:oddHBand="0" w:evenHBand="0" w:firstRowFirstColumn="0" w:firstRowLastColumn="0" w:lastRowFirstColumn="0" w:lastRowLastColumn="0"/>
-            </w:pPr>
-          </w:p>
-        </w:tc>
-        <w:tc>
-          <w:tcPr>
-            <w:tcW w:w="2338" w:type="dxa"/>
-          </w:tcPr>
-          <w:p>
-            <w:pPr>
-              <w:spacing w:line="276" w:lineRule="auto"/>
-              <w:cnfStyle w:val="000000000000" w:firstRow="0" w:lastRow="0" w:firstColumn="0" w:lastColumn="0" w:oddVBand="0" w:evenVBand="0" w:oddHBand="0" w:evenHBand="0" w:firstRowFirstColumn="0" w:firstRowLastColumn="0" w:lastRowFirstColumn="0" w:lastRowLastColumn="0"/>
-            </w:pPr>
-            <w:r>
-              <w:t>GMM + HDBSCAN</w:t>
-            </w:r>
-          </w:p>
-        </w:tc>
-      </w:tr>
-      <w:tr>
-        <w:trPr>
-          <w:cnfStyle w:val="000000100000" w:firstRow="0" w:lastRow="0" w:firstColumn="0" w:lastColumn="0" w:oddVBand="0" w:evenVBand="0" w:oddHBand="1" w:evenHBand="0" w:firstRowFirstColumn="0" w:firstRowLastColumn="0" w:lastRowFirstColumn="0" w:lastRowLastColumn="0"/>
-        </w:trPr>
-        <w:tc>
-          <w:tcPr>
-            <w:cnfStyle w:val="001000000000" w:firstRow="0" w:lastRow="0" w:firstColumn="1" w:lastColumn="0" w:oddVBand="0" w:evenVBand="0" w:oddHBand="0" w:evenHBand="0" w:firstRowFirstColumn="0" w:firstRowLastColumn="0" w:lastRowFirstColumn="0" w:lastRowLastColumn="0"/>
-            <w:tcW w:w="2337" w:type="dxa"/>
-          </w:tcPr>
-          <w:p>
-            <w:pPr>
-              <w:spacing w:line="276" w:lineRule="auto"/>
-            </w:pPr>
-            <w:r>
-              <w:t>June 18</w:t>
-            </w:r>
-          </w:p>
-        </w:tc>
-        <w:tc>
-          <w:tcPr>
-            <w:tcW w:w="2337" w:type="dxa"/>
-          </w:tcPr>
-          <w:p>
-            <w:pPr>
-              <w:spacing w:line="276" w:lineRule="auto"/>
-              <w:cnfStyle w:val="000000100000" w:firstRow="0" w:lastRow="0" w:firstColumn="0" w:lastColumn="0" w:oddVBand="0" w:evenVBand="0" w:oddHBand="1" w:evenHBand="0" w:firstRowFirstColumn="0" w:firstRowLastColumn="0" w:lastRowFirstColumn="0" w:lastRowLastColumn="0"/>
-            </w:pPr>
-          </w:p>
-        </w:tc>
-        <w:tc>
-          <w:tcPr>
-            <w:tcW w:w="2338" w:type="dxa"/>
-          </w:tcPr>
-          <w:p>
-            <w:pPr>
-              <w:spacing w:line="276" w:lineRule="auto"/>
-              <w:cnfStyle w:val="000000100000" w:firstRow="0" w:lastRow="0" w:firstColumn="0" w:lastColumn="0" w:oddVBand="0" w:evenVBand="0" w:oddHBand="1" w:evenHBand="0" w:firstRowFirstColumn="0" w:firstRowLastColumn="0" w:lastRowFirstColumn="0" w:lastRowLastColumn="0"/>
-            </w:pPr>
-          </w:p>
-        </w:tc>
-        <w:tc>
-          <w:tcPr>
-            <w:tcW w:w="2338" w:type="dxa"/>
-          </w:tcPr>
-          <w:p>
-            <w:pPr>
-              <w:spacing w:line="276" w:lineRule="auto"/>
-              <w:cnfStyle w:val="000000100000" w:firstRow="0" w:lastRow="0" w:firstColumn="0" w:lastColumn="0" w:oddVBand="0" w:evenVBand="0" w:oddHBand="1" w:evenHBand="0" w:firstRowFirstColumn="0" w:firstRowLastColumn="0" w:lastRowFirstColumn="0" w:lastRowLastColumn="0"/>
-            </w:pPr>
-            <w:r>
-              <w:t>Clustering Evaluation</w:t>
-            </w:r>
-          </w:p>
-        </w:tc>
-      </w:tr>
-      <w:tr>
-        <w:tc>
-          <w:tcPr>
-            <w:cnfStyle w:val="001000000000" w:firstRow="0" w:lastRow="0" w:firstColumn="1" w:lastColumn="0" w:oddVBand="0" w:evenVBand="0" w:oddHBand="0" w:evenHBand="0" w:firstRowFirstColumn="0" w:firstRowLastColumn="0" w:lastRowFirstColumn="0" w:lastRowLastColumn="0"/>
-            <w:tcW w:w="2337" w:type="dxa"/>
-          </w:tcPr>
-          <w:p>
-            <w:pPr>
-              <w:spacing w:line="276" w:lineRule="auto"/>
-            </w:pPr>
-            <w:r>
-              <w:t>June 19</w:t>
-            </w:r>
-          </w:p>
-        </w:tc>
-        <w:tc>
-          <w:tcPr>
-            <w:tcW w:w="2337" w:type="dxa"/>
-          </w:tcPr>
-          <w:p>
-            <w:pPr>
-              <w:spacing w:line="276" w:lineRule="auto"/>
-              <w:cnfStyle w:val="000000000000" w:firstRow="0" w:lastRow="0" w:firstColumn="0" w:lastColumn="0" w:oddVBand="0" w:evenVBand="0" w:oddHBand="0" w:evenHBand="0" w:firstRowFirstColumn="0" w:firstRowLastColumn="0" w:lastRowFirstColumn="0" w:lastRowLastColumn="0"/>
-            </w:pPr>
-          </w:p>
-        </w:tc>
-        <w:tc>
-          <w:tcPr>
-            <w:tcW w:w="2338" w:type="dxa"/>
-          </w:tcPr>
-          <w:p>
-            <w:pPr>
-              <w:spacing w:line="276" w:lineRule="auto"/>
-              <w:cnfStyle w:val="000000000000" w:firstRow="0" w:lastRow="0" w:firstColumn="0" w:lastColumn="0" w:oddVBand="0" w:evenVBand="0" w:oddHBand="0" w:evenHBand="0" w:firstRowFirstColumn="0" w:firstRowLastColumn="0" w:lastRowFirstColumn="0" w:lastRowLastColumn="0"/>
-            </w:pPr>
-          </w:p>
-        </w:tc>
-        <w:tc>
-          <w:tcPr>
-            <w:tcW w:w="2338" w:type="dxa"/>
-          </w:tcPr>
-          <w:p>
-            <w:pPr>
-              <w:spacing w:line="276" w:lineRule="auto"/>
-              <w:cnfStyle w:val="000000000000" w:firstRow="0" w:lastRow="0" w:firstColumn="0" w:lastColumn="0" w:oddVBand="0" w:evenVBand="0" w:oddHBand="0" w:evenHBand="0" w:firstRowFirstColumn="0" w:firstRowLastColumn="0" w:lastRowFirstColumn="0" w:lastRowLastColumn="0"/>
-            </w:pPr>
-            <w:r>
-              <w:t>RF Training</w:t>
-            </w:r>
-            <w:r>
-              <w:t xml:space="preserve"> + Testing</w:t>
-            </w:r>
-          </w:p>
-        </w:tc>
-      </w:tr>
-      <w:tr>
-        <w:trPr>
-          <w:cnfStyle w:val="000000100000" w:firstRow="0" w:lastRow="0" w:firstColumn="0" w:lastColumn="0" w:oddVBand="0" w:evenVBand="0" w:oddHBand="1" w:evenHBand="0" w:firstRowFirstColumn="0" w:firstRowLastColumn="0" w:lastRowFirstColumn="0" w:lastRowLastColumn="0"/>
-        </w:trPr>
-        <w:tc>
-          <w:tcPr>
-            <w:cnfStyle w:val="001000000000" w:firstRow="0" w:lastRow="0" w:firstColumn="1" w:lastColumn="0" w:oddVBand="0" w:evenVBand="0" w:oddHBand="0" w:evenHBand="0" w:firstRowFirstColumn="0" w:firstRowLastColumn="0" w:lastRowFirstColumn="0" w:lastRowLastColumn="0"/>
-            <w:tcW w:w="2337" w:type="dxa"/>
-          </w:tcPr>
-          <w:p>
-            <w:pPr>
-              <w:spacing w:line="276" w:lineRule="auto"/>
-            </w:pPr>
-            <w:r>
-              <w:t>June 20</w:t>
-            </w:r>
-          </w:p>
-        </w:tc>
-        <w:tc>
-          <w:tcPr>
-            <w:tcW w:w="2337" w:type="dxa"/>
-          </w:tcPr>
-          <w:p>
-            <w:pPr>
-              <w:spacing w:line="276" w:lineRule="auto"/>
-              <w:cnfStyle w:val="000000100000" w:firstRow="0" w:lastRow="0" w:firstColumn="0" w:lastColumn="0" w:oddVBand="0" w:evenVBand="0" w:oddHBand="1" w:evenHBand="0" w:firstRowFirstColumn="0" w:firstRowLastColumn="0" w:lastRowFirstColumn="0" w:lastRowLastColumn="0"/>
-            </w:pPr>
-          </w:p>
-        </w:tc>
-        <w:tc>
-          <w:tcPr>
-            <w:tcW w:w="2338" w:type="dxa"/>
-          </w:tcPr>
-          <w:p>
-            <w:pPr>
-              <w:spacing w:line="276" w:lineRule="auto"/>
-              <w:cnfStyle w:val="000000100000" w:firstRow="0" w:lastRow="0" w:firstColumn="0" w:lastColumn="0" w:oddVBand="0" w:evenVBand="0" w:oddHBand="1" w:evenHBand="0" w:firstRowFirstColumn="0" w:firstRowLastColumn="0" w:lastRowFirstColumn="0" w:lastRowLastColumn="0"/>
-            </w:pPr>
-            <w:r>
-              <w:t xml:space="preserve">Methodology, Results, </w:t>
-            </w:r>
-            <w:r>
-              <w:t>Discussion</w:t>
-            </w:r>
-          </w:p>
-        </w:tc>
-        <w:tc>
-          <w:tcPr>
-            <w:tcW w:w="2338" w:type="dxa"/>
-          </w:tcPr>
-          <w:p>
-            <w:pPr>
-              <w:spacing w:line="276" w:lineRule="auto"/>
-              <w:cnfStyle w:val="000000100000" w:firstRow="0" w:lastRow="0" w:firstColumn="0" w:lastColumn="0" w:oddVBand="0" w:evenVBand="0" w:oddHBand="1" w:evenHBand="0" w:firstRowFirstColumn="0" w:firstRowLastColumn="0" w:lastRowFirstColumn="0" w:lastRowLastColumn="0"/>
-            </w:pPr>
-            <w:r>
-              <w:t xml:space="preserve">RF </w:t>
-            </w:r>
-            <w:r>
-              <w:t>Evaluation</w:t>
-            </w:r>
-          </w:p>
-        </w:tc>
-      </w:tr>
-      <w:tr>
-        <w:tc>
-          <w:tcPr>
-            <w:cnfStyle w:val="001000000000" w:firstRow="0" w:lastRow="0" w:firstColumn="1" w:lastColumn="0" w:oddVBand="0" w:evenVBand="0" w:oddHBand="0" w:evenHBand="0" w:firstRowFirstColumn="0" w:firstRowLastColumn="0" w:lastRowFirstColumn="0" w:lastRowLastColumn="0"/>
-            <w:tcW w:w="2337" w:type="dxa"/>
-          </w:tcPr>
-          <w:p>
-            <w:pPr>
-              <w:spacing w:line="276" w:lineRule="auto"/>
-            </w:pPr>
-            <w:r>
-              <w:t>June 23</w:t>
-            </w:r>
-          </w:p>
-        </w:tc>
-        <w:tc>
-          <w:tcPr>
-            <w:tcW w:w="2337" w:type="dxa"/>
-          </w:tcPr>
-          <w:p>
-            <w:pPr>
-              <w:spacing w:line="276" w:lineRule="auto"/>
-              <w:cnfStyle w:val="000000000000" w:firstRow="0" w:lastRow="0" w:firstColumn="0" w:lastColumn="0" w:oddVBand="0" w:evenVBand="0" w:oddHBand="0" w:evenHBand="0" w:firstRowFirstColumn="0" w:firstRowLastColumn="0" w:lastRowFirstColumn="0" w:lastRowLastColumn="0"/>
-            </w:pPr>
-            <w:r>
-              <w:t>Final Report</w:t>
-            </w:r>
-          </w:p>
-        </w:tc>
-        <w:tc>
-          <w:tcPr>
-            <w:tcW w:w="2338" w:type="dxa"/>
-          </w:tcPr>
-          <w:p>
-            <w:pPr>
-              <w:spacing w:line="276" w:lineRule="auto"/>
-              <w:cnfStyle w:val="000000000000" w:firstRow="0" w:lastRow="0" w:firstColumn="0" w:lastColumn="0" w:oddVBand="0" w:evenVBand="0" w:oddHBand="0" w:evenHBand="0" w:firstRowFirstColumn="0" w:firstRowLastColumn="0" w:lastRowFirstColumn="0" w:lastRowLastColumn="0"/>
-            </w:pPr>
-            <w:r>
-              <w:t xml:space="preserve">Conclusion, </w:t>
-            </w:r>
-            <w:r>
-              <w:t>Summary</w:t>
-            </w:r>
-            <w:r>
-              <w:t xml:space="preserve">, </w:t>
-            </w:r>
-            <w:r>
-              <w:t>Presentation Slides</w:t>
-            </w:r>
-          </w:p>
-        </w:tc>
-        <w:tc>
-          <w:tcPr>
-            <w:tcW w:w="2338" w:type="dxa"/>
-          </w:tcPr>
-          <w:p>
-            <w:pPr>
-              <w:spacing w:line="276" w:lineRule="auto"/>
-              <w:cnfStyle w:val="000000000000" w:firstRow="0" w:lastRow="0" w:firstColumn="0" w:lastColumn="0" w:oddVBand="0" w:evenVBand="0" w:oddHBand="0" w:evenHBand="0" w:firstRowFirstColumn="0" w:firstRowLastColumn="0" w:lastRowFirstColumn="0" w:lastRowLastColumn="0"/>
-            </w:pPr>
-          </w:p>
-        </w:tc>
-      </w:tr>
-      <w:tr>
-        <w:trPr>
-          <w:cnfStyle w:val="000000100000" w:firstRow="0" w:lastRow="0" w:firstColumn="0" w:lastColumn="0" w:oddVBand="0" w:evenVBand="0" w:oddHBand="1" w:evenHBand="0" w:firstRowFirstColumn="0" w:firstRowLastColumn="0" w:lastRowFirstColumn="0" w:lastRowLastColumn="0"/>
-        </w:trPr>
-        <w:tc>
-          <w:tcPr>
-            <w:cnfStyle w:val="001000000000" w:firstRow="0" w:lastRow="0" w:firstColumn="1" w:lastColumn="0" w:oddVBand="0" w:evenVBand="0" w:oddHBand="0" w:evenHBand="0" w:firstRowFirstColumn="0" w:firstRowLastColumn="0" w:lastRowFirstColumn="0" w:lastRowLastColumn="0"/>
-            <w:tcW w:w="2337" w:type="dxa"/>
-          </w:tcPr>
-          <w:p>
-            <w:pPr>
-              <w:spacing w:line="276" w:lineRule="auto"/>
-            </w:pPr>
-            <w:r>
-              <w:lastRenderedPageBreak/>
-              <w:t>June 24</w:t>
-            </w:r>
-          </w:p>
-        </w:tc>
-        <w:tc>
-          <w:tcPr>
-            <w:tcW w:w="2337" w:type="dxa"/>
-          </w:tcPr>
-          <w:p>
-            <w:pPr>
-              <w:spacing w:line="276" w:lineRule="auto"/>
-              <w:cnfStyle w:val="000000100000" w:firstRow="0" w:lastRow="0" w:firstColumn="0" w:lastColumn="0" w:oddVBand="0" w:evenVBand="0" w:oddHBand="1" w:evenHBand="0" w:firstRowFirstColumn="0" w:firstRowLastColumn="0" w:lastRowFirstColumn="0" w:lastRowLastColumn="0"/>
-            </w:pPr>
-            <w:r>
-              <w:t>Final Presentation</w:t>
-            </w:r>
-          </w:p>
-        </w:tc>
-        <w:tc>
-          <w:tcPr>
-            <w:tcW w:w="2338" w:type="dxa"/>
-          </w:tcPr>
-          <w:p>
-            <w:pPr>
-              <w:spacing w:line="276" w:lineRule="auto"/>
-              <w:cnfStyle w:val="000000100000" w:firstRow="0" w:lastRow="0" w:firstColumn="0" w:lastColumn="0" w:oddVBand="0" w:evenVBand="0" w:oddHBand="1" w:evenHBand="0" w:firstRowFirstColumn="0" w:firstRowLastColumn="0" w:lastRowFirstColumn="0" w:lastRowLastColumn="0"/>
-            </w:pPr>
-            <w:r>
-              <w:t>Record Presentation</w:t>
-            </w:r>
-          </w:p>
-        </w:tc>
-        <w:tc>
-          <w:tcPr>
-            <w:tcW w:w="2338" w:type="dxa"/>
-          </w:tcPr>
-          <w:p>
-            <w:pPr>
-              <w:spacing w:line="276" w:lineRule="auto"/>
-              <w:cnfStyle w:val="000000100000" w:firstRow="0" w:lastRow="0" w:firstColumn="0" w:lastColumn="0" w:oddVBand="0" w:evenVBand="0" w:oddHBand="1" w:evenHBand="0" w:firstRowFirstColumn="0" w:firstRowLastColumn="0" w:lastRowFirstColumn="0" w:lastRowLastColumn="0"/>
-            </w:pPr>
-          </w:p>
-        </w:tc>
-      </w:tr>
-    </w:tbl>
+        <w:t xml:space="preserve">circumvent </w:t>
+      </w:r>
+      <w:r>
+        <w:t xml:space="preserve">any failures or difficulties in classification and turn directly towards </w:t>
+      </w:r>
+      <w:r>
+        <w:t xml:space="preserve">creating supervised models, such as a Random Forest (RF) to </w:t>
+      </w:r>
+      <w:r>
+        <w:t>directly implement into software that makes decisions on when to run different functions.</w:t>
+      </w:r>
+    </w:p>
     <w:p>
       <w:pPr>
         <w:pStyle w:val="Heading1"/>
       </w:pPr>
-      <w:bookmarkStart w:id="11" w:name="_Toc201418053"/>
-      <w:r>
-        <w:t>Conclusion</w:t>
-      </w:r>
-      <w:bookmarkEnd w:id="11"/>
-    </w:p>
-    <w:p>
-      <w:r>
-        <w:tab/>
-      </w:r>
-      <w:r>
-        <w:t xml:space="preserve">This is an ambitious project </w:t>
-      </w:r>
-      <w:r>
-        <w:t>taking</w:t>
-      </w:r>
-      <w:r>
-        <w:t xml:space="preserve"> course over the month of June 2025. Its </w:t>
-      </w:r>
-      <w:r>
-        <w:t xml:space="preserve">primary </w:t>
-      </w:r>
-      <w:r>
-        <w:t xml:space="preserve">goal is to </w:t>
-      </w:r>
-      <w:r>
-        <w:t>label the training data with</w:t>
-      </w:r>
-      <w:r>
-        <w:t xml:space="preserve"> </w:t>
-      </w:r>
-      <w:r>
-        <w:t xml:space="preserve">Deere </w:t>
-      </w:r>
-      <w:r>
-        <w:t xml:space="preserve">Development Company’s </w:t>
-      </w:r>
-      <w:r>
-        <w:t>drilling state machine</w:t>
-      </w:r>
-      <w:r>
-        <w:t xml:space="preserve"> using drilling parameters</w:t>
-      </w:r>
-      <w:r>
-        <w:t xml:space="preserve"> for </w:t>
-      </w:r>
-      <w:r>
-        <w:t xml:space="preserve">time, </w:t>
-      </w:r>
-      <w:r>
-        <w:t>flow, rotation, vibration, and WOB</w:t>
-      </w:r>
-      <w:r>
-        <w:t>.</w:t>
-      </w:r>
-      <w:r>
-        <w:t xml:space="preserve"> Its secondary goal is </w:t>
-      </w:r>
-      <w:r>
-        <w:t>implementing and testing methods for predicting a tool’s drilling state in real time.</w:t>
-      </w:r>
-      <w:r>
-        <w:t xml:space="preserve"> By </w:t>
-      </w:r>
-      <w:r>
-        <w:t>using the most accurate methods</w:t>
-      </w:r>
-      <w:r>
-        <w:t xml:space="preserve"> for labeling the nonlinear, time-series data</w:t>
-      </w:r>
-      <w:r>
-        <w:t xml:space="preserve">, </w:t>
-      </w:r>
-      <w:r>
-        <w:t xml:space="preserve">further work on creating real-time drilling state prediction tools may be </w:t>
-      </w:r>
-      <w:r>
-        <w:t xml:space="preserve">done. The final goal is for </w:t>
-      </w:r>
-      <w:r>
-        <w:t xml:space="preserve">the client </w:t>
-      </w:r>
-      <w:r>
-        <w:t xml:space="preserve">to </w:t>
-      </w:r>
-      <w:r>
-        <w:t xml:space="preserve">be able to implement other </w:t>
-      </w:r>
-      <w:r>
-        <w:t>software</w:t>
-      </w:r>
-      <w:r>
-        <w:t xml:space="preserve"> with </w:t>
-      </w:r>
-      <w:r>
-        <w:t>higher effectiveness and</w:t>
-      </w:r>
-      <w:r>
-        <w:t xml:space="preserve"> </w:t>
-      </w:r>
-      <w:r>
-        <w:t xml:space="preserve">significantly decrease costs, time, and </w:t>
-      </w:r>
-      <w:r>
-        <w:t xml:space="preserve">safety risks for workers. </w:t>
-      </w:r>
-      <w:r>
-        <w:t>The building and testing of methods w</w:t>
-      </w:r>
-      <w:r>
-        <w:t>ill be prioritized as such:</w:t>
-      </w:r>
-    </w:p>
-    <w:p>
-      <w:pPr>
-        <w:pStyle w:val="ListParagraph"/>
-        <w:numPr>
-          <w:ilvl w:val="0"/>
-          <w:numId w:val="6"/>
-        </w:numPr>
-      </w:pPr>
-      <w:r>
-        <w:t>Hidden Markov Model Training and Testing</w:t>
-      </w:r>
-    </w:p>
-    <w:p>
-      <w:pPr>
-        <w:pStyle w:val="ListParagraph"/>
-        <w:numPr>
-          <w:ilvl w:val="0"/>
-          <w:numId w:val="6"/>
-        </w:numPr>
-      </w:pPr>
-      <w:r>
-        <w:t>G</w:t>
-      </w:r>
-      <w:r>
-        <w:t xml:space="preserve">aussian </w:t>
-      </w:r>
-      <w:r>
-        <w:t>M</w:t>
-      </w:r>
-      <w:r>
-        <w:t xml:space="preserve">ixture </w:t>
-      </w:r>
-      <w:r>
-        <w:t>M</w:t>
-      </w:r>
-      <w:r>
-        <w:t>odel</w:t>
-      </w:r>
-      <w:r>
-        <w:t xml:space="preserve"> Training</w:t>
-      </w:r>
-    </w:p>
-    <w:p>
-      <w:pPr>
-        <w:pStyle w:val="ListParagraph"/>
-        <w:numPr>
-          <w:ilvl w:val="0"/>
-          <w:numId w:val="6"/>
-        </w:numPr>
-      </w:pPr>
-      <w:r>
-        <w:t>HDBSCAN Training</w:t>
-      </w:r>
-    </w:p>
-    <w:p>
-      <w:pPr>
-        <w:pStyle w:val="ListParagraph"/>
-        <w:numPr>
-          <w:ilvl w:val="0"/>
-          <w:numId w:val="6"/>
-        </w:numPr>
-      </w:pPr>
-      <w:r>
-        <w:t>Clustering Methods Evaluation</w:t>
-      </w:r>
-    </w:p>
-    <w:p>
-      <w:pPr>
-        <w:pStyle w:val="ListParagraph"/>
-        <w:numPr>
-          <w:ilvl w:val="0"/>
-          <w:numId w:val="6"/>
-        </w:numPr>
-      </w:pPr>
-      <w:r>
-        <w:t>Random Forest Training and Testing</w:t>
-      </w:r>
-    </w:p>
-    <w:p>
-      <w:pPr>
-        <w:ind w:firstLine="360"/>
-      </w:pPr>
-      <w:r>
-        <w:t>The methods outlined above will be trained on drilling data</w:t>
-      </w:r>
-      <w:r>
-        <w:t xml:space="preserve"> from five runs on two different wells. It will then be tested on </w:t>
-      </w:r>
-      <w:r>
-        <w:t xml:space="preserve">one run from a third well. All drilling data was provided by the client from real oil rig </w:t>
-      </w:r>
-      <w:r>
-        <w:t xml:space="preserve">work. </w:t>
-      </w:r>
-      <w:r>
-        <w:t xml:space="preserve">Once the </w:t>
-      </w:r>
-      <w:r>
-        <w:t xml:space="preserve">methods that were developed (based on time availability) </w:t>
-      </w:r>
-      <w:r>
-        <w:t xml:space="preserve">have been tested, they’ll be evaluated for performance based </w:t>
-      </w:r>
-      <w:r>
-        <w:t xml:space="preserve">largely on domain knowledge and </w:t>
-      </w:r>
-      <w:r>
-        <w:t>inter/intra cluster similarity indexes</w:t>
-      </w:r>
-      <w:r>
-        <w:t>.</w:t>
-      </w:r>
-    </w:p>
-    <w:p>
-      <w:pPr>
-        <w:pStyle w:val="Heading1"/>
-      </w:pPr>
-      <w:bookmarkStart w:id="12" w:name="_Toc201418054"/>
-      <w:r>
-        <w:lastRenderedPageBreak/>
+      <w:bookmarkStart w:id="13" w:name="_Toc201605771"/>
+      <w:r>
         <w:t>References</w:t>
       </w:r>
-      <w:bookmarkEnd w:id="12"/>
+      <w:bookmarkEnd w:id="13"/>
     </w:p>
     <w:p>
       <w:pPr>
@@ -4679,47 +4941,37 @@
         <w:ind w:left="720" w:hanging="720"/>
       </w:pPr>
       <w:r>
-        <w:t xml:space="preserve">Blachowicz, T., </w:t>
-      </w:r>
-      <w:r>
-        <w:t xml:space="preserve">Wylezek, J., Sokol, Z., and </w:t>
-      </w:r>
-      <w:r>
-        <w:t>Bondel, M. (2025). “Real Time Analysis of Industrial Data</w:t>
-      </w:r>
-      <w:r>
-        <w:t xml:space="preserve"> Using the Unsupervised Hierarchical Density-Based Spatial Clustering for Applications with Noise </w:t>
-      </w:r>
-      <w:r>
-        <w:t xml:space="preserve">in Monitoring the Welding Process in a Robotic Cell.” </w:t>
-      </w:r>
-      <w:r>
-        <w:rPr>
-          <w:i/>
-          <w:iCs/>
-        </w:rPr>
-        <w:t>Information</w:t>
-      </w:r>
-      <w:r>
-        <w:rPr>
-          <w:i/>
-          <w:iCs/>
-        </w:rPr>
-        <w:t xml:space="preserve"> 16</w:t>
-      </w:r>
-      <w:r>
-        <w:t xml:space="preserve">(2). </w:t>
-      </w:r>
-      <w:hyperlink r:id="rId9" w:history="1">
-        <w:r>
-          <w:rPr>
-            <w:rStyle w:val="Hyperlink"/>
-          </w:rPr>
-          <w:t>https://doi.org/10.3390/info16020079</w:t>
-        </w:r>
-      </w:hyperlink>
-      <w:r>
-        <w:t xml:space="preserve">. </w:t>
+        <w:t>Deere</w:t>
+      </w:r>
+      <w:r>
+        <w:t>,</w:t>
+      </w:r>
+      <w:r>
+        <w:t xml:space="preserve"> P.</w:t>
+      </w:r>
+      <w:r>
+        <w:t xml:space="preserve"> </w:t>
+      </w:r>
+      <w:r>
+        <w:t>P</w:t>
+      </w:r>
+      <w:r>
+        <w:t xml:space="preserve">ersonal </w:t>
+      </w:r>
+      <w:r>
+        <w:t>C</w:t>
+      </w:r>
+      <w:r>
+        <w:t>ommunication</w:t>
+      </w:r>
+      <w:r>
+        <w:t>.</w:t>
+      </w:r>
+      <w:r>
+        <w:t xml:space="preserve"> March </w:t>
+      </w:r>
+      <w:r>
+        <w:t>8, 2025.</w:t>
       </w:r>
     </w:p>
     <w:p>
@@ -4728,94 +4980,21 @@
         <w:ind w:left="720" w:hanging="720"/>
       </w:pPr>
       <w:r>
-        <w:t>C</w:t>
-      </w:r>
-      <w:r>
-        <w:t>ar</w:t>
-      </w:r>
-      <w:r>
-        <w:t xml:space="preserve">rasco, O. </w:t>
-      </w:r>
-      <w:r>
-        <w:t xml:space="preserve">and Whitfield, B. (2024). </w:t>
-      </w:r>
-      <w:r>
-        <w:t xml:space="preserve">“Gaussian Mixture Model Explained.” </w:t>
-      </w:r>
-      <w:r>
-        <w:rPr>
-          <w:i/>
-          <w:iCs/>
-        </w:rPr>
-        <w:t>Built In.</w:t>
+        <w:t xml:space="preserve">Hassaan, S., Mohamed, A., Ibrahim, A. F., </w:t>
+      </w:r>
+      <w:r>
+        <w:t>and</w:t>
       </w:r>
       <w:r>
         <w:t xml:space="preserve"> </w:t>
       </w:r>
-      <w:hyperlink r:id="rId10" w:history="1">
-        <w:r>
-          <w:rPr>
-            <w:rStyle w:val="Hyperlink"/>
-          </w:rPr>
-          <w:t>https://builtin.com/articles/gaussian-mixture-model</w:t>
-        </w:r>
-      </w:hyperlink>
-      <w:r>
-        <w:t xml:space="preserve">. </w:t>
-      </w:r>
-    </w:p>
-    <w:p>
-      <w:pPr>
-        <w:spacing w:line="240" w:lineRule="auto"/>
-        <w:ind w:left="720" w:hanging="720"/>
-      </w:pPr>
-      <w:r>
-        <w:t>Deere</w:t>
-      </w:r>
-      <w:r>
-        <w:t>,</w:t>
-      </w:r>
-      <w:r>
-        <w:t xml:space="preserve"> P.</w:t>
-      </w:r>
-      <w:r>
-        <w:t xml:space="preserve"> </w:t>
-      </w:r>
-      <w:r>
-        <w:t>P</w:t>
-      </w:r>
-      <w:r>
-        <w:t xml:space="preserve">ersonal </w:t>
-      </w:r>
-      <w:r>
-        <w:t>C</w:t>
-      </w:r>
-      <w:r>
-        <w:t>ommunication</w:t>
-      </w:r>
-      <w:r>
-        <w:t>.</w:t>
-      </w:r>
-      <w:r>
-        <w:t xml:space="preserve"> March </w:t>
-      </w:r>
-      <w:r>
-        <w:t>8, 2025.</w:t>
-      </w:r>
-    </w:p>
-    <w:p>
-      <w:pPr>
-        <w:spacing w:line="240" w:lineRule="auto"/>
-        <w:ind w:left="720" w:hanging="720"/>
-      </w:pPr>
-      <w:r>
-        <w:t xml:space="preserve">Hassaan, S., Mohamed, A., Ibrahim, A. F., </w:t>
-      </w:r>
-      <w:r>
-        <w:t>and</w:t>
-      </w:r>
-      <w:r>
-        <w:t xml:space="preserve"> Elkatatny, S. (2024). </w:t>
+      <w:proofErr w:type="spellStart"/>
+      <w:r>
+        <w:t>Elkatatny</w:t>
+      </w:r>
+      <w:proofErr w:type="spellEnd"/>
+      <w:r>
+        <w:t xml:space="preserve">, S. (2024). </w:t>
       </w:r>
       <w:r>
         <w:t>“</w:t>
@@ -4849,7 +5028,7 @@
       <w:r>
         <w:t xml:space="preserve">(15), 17066–17075. </w:t>
       </w:r>
-      <w:hyperlink r:id="rId11" w:history="1">
+      <w:hyperlink r:id="rId14" w:history="1">
         <w:r>
           <w:rPr>
             <w:rStyle w:val="Hyperlink"/>
@@ -4865,9 +5044,17 @@
       <w:pPr>
         <w:spacing w:line="240" w:lineRule="auto"/>
         <w:ind w:left="720" w:hanging="720"/>
-      </w:pPr>
-      <w:r>
-        <w:t xml:space="preserve">Jurafsky, D. and </w:t>
+        <w:rPr>
+          <w:lang w:val="de-DE"/>
+        </w:rPr>
+      </w:pPr>
+      <w:proofErr w:type="spellStart"/>
+      <w:r>
+        <w:t>Jurafsky</w:t>
+      </w:r>
+      <w:proofErr w:type="spellEnd"/>
+      <w:r>
+        <w:t xml:space="preserve">, D. and </w:t>
       </w:r>
       <w:r>
         <w:t>Martin, J. (2024). “</w:t>
@@ -4885,15 +5072,19 @@
       <w:r>
         <w:t xml:space="preserve">. </w:t>
       </w:r>
-      <w:hyperlink r:id="rId12" w:history="1">
+      <w:hyperlink r:id="rId15" w:history="1">
         <w:r>
           <w:rPr>
             <w:rStyle w:val="Hyperlink"/>
+            <w:lang w:val="de-DE"/>
           </w:rPr>
           <w:t>https://web.stanford.edu/~jurafsky/slp3/A.pdf</w:t>
         </w:r>
       </w:hyperlink>
       <w:r>
+        <w:rPr>
+          <w:lang w:val="de-DE"/>
+        </w:rPr>
         <w:t xml:space="preserve">. </w:t>
       </w:r>
     </w:p>
@@ -4901,163 +5092,18 @@
       <w:pPr>
         <w:spacing w:line="240" w:lineRule="auto"/>
         <w:ind w:left="720" w:hanging="720"/>
-      </w:pPr>
-      <w:r>
-        <w:t xml:space="preserve">Lee, S. </w:t>
-      </w:r>
-      <w:r>
-        <w:t>(2025). “</w:t>
-      </w:r>
-      <w:r>
-        <w:t xml:space="preserve">10 Statistical Methods to Boost </w:t>
-      </w:r>
-      <w:r>
-        <w:t>Clustering Validity Results</w:t>
-      </w:r>
-      <w:r>
-        <w:t>.”</w:t>
-      </w:r>
-      <w:r>
-        <w:t xml:space="preserve"> </w:t>
-      </w:r>
-      <w:r>
         <w:rPr>
-          <w:i/>
-          <w:iCs/>
+          <w:lang w:val="de-DE"/>
         </w:rPr>
-        <w:t>Number Analytics</w:t>
-      </w:r>
-      <w:r>
-        <w:t xml:space="preserve">. </w:t>
-      </w:r>
-      <w:hyperlink r:id="rId13" w:anchor="google_vignette" w:history="1">
-        <w:r>
-          <w:rPr>
-            <w:rStyle w:val="Hyperlink"/>
-          </w:rPr>
-          <w:t>https://www.numberanalytics.com/blog/10-statistical-methods-clustering-validity-results</w:t>
-        </w:r>
-      </w:hyperlink>
-      <w:r>
-        <w:t xml:space="preserve">. </w:t>
-      </w:r>
-    </w:p>
-    <w:p>
-      <w:pPr>
-        <w:spacing w:line="240" w:lineRule="auto"/>
-        <w:ind w:left="720" w:hanging="720"/>
-      </w:pPr>
-      <w:r>
-        <w:t xml:space="preserve">McInnes, L. (2016). “How HDBSCAN Works.” </w:t>
-      </w:r>
-      <w:r>
-        <w:rPr>
-          <w:i/>
-          <w:iCs/>
-        </w:rPr>
-        <w:t>HDBSCAN</w:t>
-      </w:r>
-      <w:r>
-        <w:t xml:space="preserve">. </w:t>
-      </w:r>
-      <w:hyperlink r:id="rId14" w:history="1">
-        <w:r>
-          <w:rPr>
-            <w:rStyle w:val="Hyperlink"/>
-          </w:rPr>
-          <w:t>https://hdbscan.readthedocs.io/en/latest/how_hdbscan_works.html</w:t>
-        </w:r>
-      </w:hyperlink>
-      <w:r>
-        <w:t xml:space="preserve">. </w:t>
-      </w:r>
-    </w:p>
-    <w:p>
-      <w:pPr>
-        <w:spacing w:line="240" w:lineRule="auto"/>
-        <w:ind w:left="720" w:hanging="720"/>
-      </w:pPr>
-      <w:r>
-        <w:t>McInnes, L</w:t>
-      </w:r>
-      <w:r>
-        <w:t>.</w:t>
-      </w:r>
-      <w:r>
-        <w:t xml:space="preserve"> (2018). “How UMAP Works.”</w:t>
-      </w:r>
-      <w:r>
-        <w:t xml:space="preserve"> </w:t>
-      </w:r>
-      <w:r>
-        <w:rPr>
-          <w:i/>
-          <w:iCs/>
-        </w:rPr>
-        <w:t>Uniform Manifold Approximation &amp; Projection</w:t>
-      </w:r>
-      <w:r>
-        <w:t xml:space="preserve">. </w:t>
-      </w:r>
-      <w:hyperlink r:id="rId15" w:history="1">
-        <w:r>
-          <w:rPr>
-            <w:rStyle w:val="Hyperlink"/>
-          </w:rPr>
-          <w:t>https://umap-learn.readthedocs.io/en/latest/how_umap_works.html</w:t>
-        </w:r>
-      </w:hyperlink>
-      <w:r>
-        <w:t xml:space="preserve">. </w:t>
-      </w:r>
-    </w:p>
-    <w:p>
-      <w:pPr>
-        <w:spacing w:line="240" w:lineRule="auto"/>
-        <w:ind w:left="720" w:hanging="720"/>
-      </w:pPr>
-      <w:r>
-        <w:t>Morad, N. (</w:t>
-      </w:r>
-      <w:r>
-        <w:t xml:space="preserve">2020). “Modeling Methods in Clustering Analysis for Time Series Data.” </w:t>
-      </w:r>
-      <w:r>
-        <w:rPr>
-          <w:i/>
-          <w:iCs/>
-        </w:rPr>
-        <w:t>Open Journal of Statistics</w:t>
-      </w:r>
-      <w:r>
-        <w:rPr>
-          <w:i/>
-          <w:iCs/>
-        </w:rPr>
-        <w:t xml:space="preserve"> 10</w:t>
-      </w:r>
-      <w:r>
-        <w:t xml:space="preserve">(3), 565-580. </w:t>
-      </w:r>
-      <w:hyperlink r:id="rId16" w:history="1">
-        <w:r>
-          <w:rPr>
-            <w:rStyle w:val="Hyperlink"/>
-          </w:rPr>
-          <w:t>https://doi.org/10.4236/ojs.2020.103034</w:t>
-        </w:r>
-      </w:hyperlink>
-      <w:r>
-        <w:t xml:space="preserve">. </w:t>
-      </w:r>
-    </w:p>
-    <w:p>
-      <w:pPr>
-        <w:spacing w:line="240" w:lineRule="auto"/>
-        <w:ind w:left="720" w:hanging="720"/>
-      </w:pPr>
-      <w:r>
-        <w:t xml:space="preserve">Tashnizi, M. (2022). </w:t>
+      </w:pPr>
+      <w:proofErr w:type="spellStart"/>
+      <w:r>
+        <w:lastRenderedPageBreak/>
+        <w:t>Tashnizi</w:t>
+      </w:r>
+      <w:proofErr w:type="spellEnd"/>
+      <w:r>
+        <w:t xml:space="preserve">, M. (2022). </w:t>
       </w:r>
       <w:r>
         <w:rPr>
@@ -5070,207 +5116,92 @@
         <w:t xml:space="preserve">. </w:t>
       </w:r>
       <w:r>
+        <w:rPr>
+          <w:lang w:val="de-DE"/>
+        </w:rPr>
         <w:t>[</w:t>
       </w:r>
-      <w:r>
-        <w:t xml:space="preserve">Master’s thesis, </w:t>
-      </w:r>
-      <w:r>
-        <w:t>Montan Universitat Loeben</w:t>
-      </w:r>
-      <w:r>
+      <w:proofErr w:type="spellStart"/>
+      <w:r>
+        <w:rPr>
+          <w:lang w:val="de-DE"/>
+        </w:rPr>
+        <w:t>Master’s</w:t>
+      </w:r>
+      <w:proofErr w:type="spellEnd"/>
+      <w:r>
+        <w:rPr>
+          <w:lang w:val="de-DE"/>
+        </w:rPr>
+        <w:t xml:space="preserve"> </w:t>
+      </w:r>
+      <w:proofErr w:type="spellStart"/>
+      <w:r>
+        <w:rPr>
+          <w:lang w:val="de-DE"/>
+        </w:rPr>
+        <w:t>thesis</w:t>
+      </w:r>
+      <w:proofErr w:type="spellEnd"/>
+      <w:r>
+        <w:rPr>
+          <w:lang w:val="de-DE"/>
+        </w:rPr>
+        <w:t xml:space="preserve">, </w:t>
+      </w:r>
+      <w:r>
+        <w:rPr>
+          <w:lang w:val="de-DE"/>
+        </w:rPr>
+        <w:t xml:space="preserve">Montan </w:t>
+      </w:r>
+      <w:proofErr w:type="spellStart"/>
+      <w:r>
+        <w:rPr>
+          <w:lang w:val="de-DE"/>
+        </w:rPr>
+        <w:t>Universitat</w:t>
+      </w:r>
+      <w:proofErr w:type="spellEnd"/>
+      <w:r>
+        <w:rPr>
+          <w:lang w:val="de-DE"/>
+        </w:rPr>
+        <w:t xml:space="preserve"> </w:t>
+      </w:r>
+      <w:proofErr w:type="spellStart"/>
+      <w:r>
+        <w:rPr>
+          <w:lang w:val="de-DE"/>
+        </w:rPr>
+        <w:t>Loeben</w:t>
+      </w:r>
+      <w:proofErr w:type="spellEnd"/>
+      <w:r>
+        <w:rPr>
+          <w:lang w:val="de-DE"/>
+        </w:rPr>
         <w:t xml:space="preserve">]. </w:t>
       </w:r>
-      <w:hyperlink r:id="rId17" w:history="1">
+      <w:hyperlink r:id="rId16" w:history="1">
         <w:r>
           <w:rPr>
             <w:rStyle w:val="Hyperlink"/>
+            <w:lang w:val="de-DE"/>
           </w:rPr>
           <w:t>https://pureadmin.unileoben.ac.at/ws/portalfiles/portal/17548059/AC16839895.pdf</w:t>
         </w:r>
       </w:hyperlink>
       <w:r>
-        <w:t xml:space="preserve">. </w:t>
-      </w:r>
-    </w:p>
-    <w:p>
-      <w:pPr>
-        <w:spacing w:line="240" w:lineRule="auto"/>
-        <w:ind w:left="720" w:hanging="720"/>
-      </w:pPr>
-      <w:r>
-        <w:t xml:space="preserve">Weiwei, J., Yupeng, Z., </w:t>
-      </w:r>
-      <w:r>
-        <w:t>Wei, A., and Jianwei, L. (2016). “Application of Gaussian Mixture Model</w:t>
-      </w:r>
-      <w:r>
-        <w:t xml:space="preserve"> in Identification of Oil Spill on Sea.” </w:t>
-      </w:r>
-      <w:r>
         <w:rPr>
-          <w:i/>
-          <w:iCs/>
+          <w:lang w:val="de-DE"/>
         </w:rPr>
-        <w:t xml:space="preserve">Sixth International Conference on Machinery, Materials, Environment, </w:t>
-      </w:r>
-      <w:r>
-        <w:rPr>
-          <w:i/>
-          <w:iCs/>
-        </w:rPr>
-        <w:t>Biotechnology, and Computer</w:t>
-      </w:r>
-      <w:r>
-        <w:t xml:space="preserve">. </w:t>
-      </w:r>
-      <w:hyperlink r:id="rId18" w:history="1">
-        <w:r>
-          <w:rPr>
-            <w:rStyle w:val="Hyperlink"/>
-          </w:rPr>
-          <w:t>https://www.atlantis-press.com/article/25858820.pdf</w:t>
-        </w:r>
-      </w:hyperlink>
-      <w:r>
         <w:t>.</w:t>
       </w:r>
     </w:p>
-    <w:p>
-      <w:pPr>
-        <w:spacing w:line="240" w:lineRule="auto"/>
-        <w:ind w:left="720" w:hanging="720"/>
-      </w:pPr>
-      <w:r>
-        <w:t>Zhang, </w:t>
-      </w:r>
-      <w:r>
-        <w:t>L.,</w:t>
-      </w:r>
-      <w:r>
-        <w:t xml:space="preserve"> Su,</w:t>
-      </w:r>
-      <w:r>
-        <w:t xml:space="preserve"> X., </w:t>
-      </w:r>
-      <w:r>
-        <w:t>Wang,</w:t>
-      </w:r>
-      <w:r>
-        <w:t xml:space="preserve"> Y.,</w:t>
-      </w:r>
-      <w:r>
-        <w:t> Wang,</w:t>
-      </w:r>
-      <w:r>
-        <w:t xml:space="preserve"> M.,</w:t>
-      </w:r>
-      <w:r>
-        <w:t> Yang,</w:t>
-      </w:r>
-      <w:r>
-        <w:t xml:space="preserve"> X.,</w:t>
-      </w:r>
-      <w:r>
-        <w:t> and Xu</w:t>
-      </w:r>
-      <w:r>
-        <w:t>, Z. (2024).</w:t>
-      </w:r>
-      <w:r>
-        <w:t> "HDBSCAN-</w:t>
-      </w:r>
-      <w:r>
-        <w:t>B</w:t>
-      </w:r>
-      <w:r>
-        <w:t xml:space="preserve">ased </w:t>
-      </w:r>
-      <w:r>
-        <w:t>S</w:t>
-      </w:r>
-      <w:r>
-        <w:t xml:space="preserve">emantic </w:t>
-      </w:r>
-      <w:r>
-        <w:t>C</w:t>
-      </w:r>
-      <w:r>
-        <w:t xml:space="preserve">lustering </w:t>
-      </w:r>
-      <w:r>
-        <w:t>M</w:t>
-      </w:r>
-      <w:r>
-        <w:t xml:space="preserve">odel in </w:t>
-      </w:r>
-      <w:r>
-        <w:t>C</w:t>
-      </w:r>
-      <w:r>
-        <w:t xml:space="preserve">lassifying </w:t>
-      </w:r>
-      <w:r>
-        <w:t>I</w:t>
-      </w:r>
-      <w:r>
-        <w:t xml:space="preserve">ncidents on </w:t>
-      </w:r>
-      <w:r>
-        <w:t>S</w:t>
-      </w:r>
-      <w:r>
-        <w:t xml:space="preserve">ecurity and </w:t>
-      </w:r>
-      <w:r>
-        <w:t>E</w:t>
-      </w:r>
-      <w:r>
-        <w:t xml:space="preserve">nvironmental </w:t>
-      </w:r>
-      <w:r>
-        <w:t>C</w:t>
-      </w:r>
-      <w:r>
-        <w:t xml:space="preserve">onservation </w:t>
-      </w:r>
-      <w:r>
-        <w:t>M</w:t>
-      </w:r>
-      <w:r>
-        <w:t>anagement",</w:t>
-      </w:r>
-      <w:r>
-        <w:t xml:space="preserve"> </w:t>
-      </w:r>
-      <w:r>
-        <w:rPr>
-          <w:i/>
-          <w:iCs/>
-        </w:rPr>
-        <w:t>Ninth International Symposium on Advances in Electrical, Electronics, and Computer Engineering</w:t>
-      </w:r>
-      <w:r>
-        <w:t>.</w:t>
-      </w:r>
-      <w:r>
-        <w:t> </w:t>
-      </w:r>
-      <w:hyperlink r:id="rId19" w:tgtFrame="_blank" w:history="1">
-        <w:r>
-          <w:rPr>
-            <w:rStyle w:val="Hyperlink"/>
-          </w:rPr>
-          <w:t>https://doi.org/10.1117/12.3033910</w:t>
-        </w:r>
-      </w:hyperlink>
-      <w:r>
-        <w:t>.</w:t>
-      </w:r>
-    </w:p>
     <w:sectPr>
-      <w:headerReference w:type="default" r:id="rId20"/>
-      <w:footerReference w:type="default" r:id="rId21"/>
+      <w:headerReference w:type="default" r:id="rId17"/>
+      <w:footerReference w:type="default" r:id="rId18"/>
       <w:pgSz w:w="12240" w:h="15840"/>
       <w:pgMar w:top="1440" w:right="1440" w:bottom="1440" w:left="1440" w:header="720" w:footer="720" w:gutter="0"/>
       <w:pgNumType w:start="0"/>

</xml_diff>